<commit_message>
Redo full review with updated findings in DOCX and PDF document files
Co-authored-by: Samat-ai <85476035+Samat-ai@users.noreply.github.com>
</commit_message>
<xml_diff>
--- a/PROJECT_CURRENT_STATE_REVIEW.docx
+++ b/PROJECT_CURRENT_STATE_REVIEW.docx
@@ -4,39 +4,73 @@
   <w:body>
     <w:p>
       <w:pPr>
-        <w:pStyle w:val="Heading1"/>
+        <w:pStyle w:val="Title"/>
+        <w:jc w:val="center"/>
       </w:pPr>
       <w:r>
+        <w:rPr>
+          <w:color w:val="1A56DB"/>
+          <w:sz w:val="44"/>
+        </w:rPr>
         <w:t>GoalForge — Current State Review Report</w:t>
-      </w:r>
-    </w:p>
-    <w:p/>
-    <w:p>
-      <w:r>
-        <w:t xml:space="preserve">Date: 2026-03-13  </w:t>
       </w:r>
     </w:p>
     <w:p>
       <w:r>
-        <w:t>Reviewer roles: **Lead Product Manager** + **Senior Software Engineer**</w:t>
+        <w:rPr>
+          <w:b/>
+          <w:sz w:val="20"/>
+        </w:rPr>
+        <w:t xml:space="preserve">Date: </w:t>
+      </w:r>
+      <w:r>
+        <w:rPr>
+          <w:sz w:val="20"/>
+        </w:rPr>
+        <w:t>2026-03-14</w:t>
+      </w:r>
+    </w:p>
+    <w:p>
+      <w:r>
+        <w:rPr>
+          <w:b/>
+          <w:sz w:val="20"/>
+        </w:rPr>
+        <w:t xml:space="preserve">Reviewer roles: </w:t>
+      </w:r>
+      <w:r>
+        <w:rPr>
+          <w:sz w:val="20"/>
+        </w:rPr>
+        <w:t>Lead Product Manager + Senior Software Engineer</w:t>
+      </w:r>
+    </w:p>
+    <w:p>
+      <w:r>
+        <w:rPr>
+          <w:b/>
+          <w:sz w:val="20"/>
+        </w:rPr>
+        <w:t xml:space="preserve">Prior review date: </w:t>
+      </w:r>
+      <w:r>
+        <w:rPr>
+          <w:sz w:val="20"/>
+        </w:rPr>
+        <w:t>2026-03-13 (PR #24)</w:t>
       </w:r>
     </w:p>
     <w:p/>
     <w:p>
       <w:pPr>
-        <w:pStyle w:val="Heading2"/>
+        <w:pStyle w:val="Heading1"/>
       </w:pPr>
       <w:r>
+        <w:rPr>
+          <w:color w:val="1A56DB"/>
+          <w:sz w:val="32"/>
+        </w:rPr>
         <w:t>Scope Reviewed</w:t>
-      </w:r>
-    </w:p>
-    <w:p/>
-    <w:p>
-      <w:pPr>
-        <w:pStyle w:val="ListBullet"/>
-      </w:pPr>
-      <w:r>
-        <w:t>Backend: `apps/api` (FastAPI, auth, AI orchestration, data model, tests)</w:t>
       </w:r>
     </w:p>
     <w:p>
@@ -44,7 +78,10 @@
         <w:pStyle w:val="ListBullet"/>
       </w:pPr>
       <w:r>
-        <w:t>Frontend: `apps/web` (React/Vite UX, state management, API integration)</w:t>
+        <w:rPr>
+          <w:sz w:val="21"/>
+        </w:rPr>
+        <w:t>Backend: apps/api (FastAPI, auth, AI orchestration, data model, tests)</w:t>
       </w:r>
     </w:p>
     <w:p>
@@ -52,141 +89,10 @@
         <w:pStyle w:val="ListBullet"/>
       </w:pPr>
       <w:r>
-        <w:t>CI and project setup: `.github/workflows/ci.yml`, root and app READMEs</w:t>
-      </w:r>
-    </w:p>
-    <w:p/>
-    <w:p/>
-    <w:p/>
-    <w:p>
-      <w:pPr>
-        <w:pStyle w:val="Heading2"/>
-      </w:pPr>
-      <w:r>
-        <w:t>1) Lead Product Manager Review</w:t>
-      </w:r>
-    </w:p>
-    <w:p/>
-    <w:p>
-      <w:pPr>
-        <w:pStyle w:val="Heading3"/>
-      </w:pPr>
-      <w:r>
-        <w:t>Product strengths</w:t>
-      </w:r>
-    </w:p>
-    <w:p/>
-    <w:p>
-      <w:r>
-        <w:t xml:space="preserve">1. **Clear core value proposition**  </w:t>
-      </w:r>
-    </w:p>
-    <w:p>
-      <w:r>
-        <w:t xml:space="preserve">   GoalForge has a differentiated loop: AI-generated SMART goals + sprint tasks + gamification (`README.md`, dashboard/analytics UX).</w:t>
-      </w:r>
-    </w:p>
-    <w:p/>
-    <w:p>
-      <w:r>
-        <w:t xml:space="preserve">2. **Coherent motivational system**  </w:t>
-      </w:r>
-    </w:p>
-    <w:p>
-      <w:r>
-        <w:t xml:space="preserve">   Star points, streaks, evolution stages, and “Hall of Fame” are implemented end-to-end and visible in UX (`apps/web/src/pages/Dashboard.tsx`, `apps/web/src/pages/Analytics.tsx`).</w:t>
-      </w:r>
-    </w:p>
-    <w:p/>
-    <w:p>
-      <w:r>
-        <w:t xml:space="preserve">3. **Foundational user journey exists**  </w:t>
-      </w:r>
-    </w:p>
-    <w:p>
-      <w:r>
-        <w:t xml:space="preserve">   Sign-in/sign-up, dashboard, analytics, and protected routes are in place (`apps/web/src/App.tsx`).</w:t>
-      </w:r>
-    </w:p>
-    <w:p/>
-    <w:p>
-      <w:pPr>
-        <w:pStyle w:val="Heading3"/>
-      </w:pPr>
-      <w:r>
-        <w:t>Product risks / gaps</w:t>
-      </w:r>
-    </w:p>
-    <w:p/>
-    <w:p>
-      <w:r>
-        <w:t xml:space="preserve">1. **High feature concentration in one UI file slows iteration velocity**  </w:t>
-      </w:r>
-    </w:p>
-    <w:p>
-      <w:r>
-        <w:t xml:space="preserve">   Dashboard behavior and rendering are concentrated in one large page component (`apps/web/src/pages/Dashboard.tsx`), increasing regression risk for roadmap delivery.</w:t>
-      </w:r>
-    </w:p>
-    <w:p/>
-    <w:p>
-      <w:r>
-        <w:t xml:space="preserve">2. **No frontend automated tests**  </w:t>
-      </w:r>
-    </w:p>
-    <w:p>
-      <w:r>
-        <w:t xml:space="preserve">   There are backend tests, but no frontend tests in `apps/web/src`, limiting release confidence for UX changes.</w:t>
-      </w:r>
-    </w:p>
-    <w:p/>
-    <w:p>
-      <w:r>
-        <w:t xml:space="preserve">3. **Scalability gap in goal listing API**  </w:t>
-      </w:r>
-    </w:p>
-    <w:p>
-      <w:r>
-        <w:t xml:space="preserve">   Goals API currently returns all goals without pagination (`apps/api/main.py`, `list_goals`), which can degrade UX and performance for heavy users.</w:t>
-      </w:r>
-    </w:p>
-    <w:p/>
-    <w:p>
-      <w:r>
-        <w:t xml:space="preserve">4. **Operational reliability mismatch between local and CI defaults**  </w:t>
-      </w:r>
-    </w:p>
-    <w:p>
-      <w:r>
-        <w:t xml:space="preserve">   Local backend tests can fail unless rate limiting is disabled via env override, while CI explicitly sets `RATE_LIMIT_ENABLED=false` (`.github/workflows/ci.yml`).</w:t>
-      </w:r>
-    </w:p>
-    <w:p/>
-    <w:p>
-      <w:pPr>
-        <w:pStyle w:val="Heading3"/>
-      </w:pPr>
-      <w:r>
-        <w:t>PM priority recommendations (without removing shipped features)</w:t>
-      </w:r>
-    </w:p>
-    <w:p/>
-    <w:p>
-      <w:pPr>
-        <w:pStyle w:val="ListBullet"/>
-      </w:pPr>
-      <w:r>
-        <w:t>**P0 (next sprint):**</w:t>
-      </w:r>
-    </w:p>
-    <w:p>
-      <w:r>
-        <w:t xml:space="preserve">  - Add frontend test baseline for critical flows (goal creation, task completion, status update).</w:t>
-      </w:r>
-    </w:p>
-    <w:p>
-      <w:r>
-        <w:t xml:space="preserve">  - Split Dashboard into composable feature components to reduce delivery risk.</w:t>
+        <w:rPr>
+          <w:sz w:val="21"/>
+        </w:rPr>
+        <w:t>Frontend: apps/web (React/Vite UX, state management, API integration)</w:t>
       </w:r>
     </w:p>
     <w:p>
@@ -194,17 +100,30 @@
         <w:pStyle w:val="ListBullet"/>
       </w:pPr>
       <w:r>
-        <w:t>**P1:**</w:t>
+        <w:rPr>
+          <w:sz w:val="21"/>
+        </w:rPr>
+        <w:t>CI and project setup: .github/workflows/ci.yml, root and app READMEs</w:t>
+      </w:r>
+    </w:p>
+    <w:p>
+      <w:pPr>
+        <w:pStyle w:val="Heading1"/>
+      </w:pPr>
+      <w:r>
+        <w:rPr>
+          <w:color w:val="1A56DB"/>
+          <w:sz w:val="32"/>
+        </w:rPr>
+        <w:t>Changes Since Previous Review (2026-03-13)</w:t>
       </w:r>
     </w:p>
     <w:p>
       <w:r>
-        <w:t xml:space="preserve">  - Add paginated goals listing and front-end support.</w:t>
-      </w:r>
-    </w:p>
-    <w:p>
-      <w:r>
-        <w:t xml:space="preserve">  - Add explicit failure UX for profile/AI-related fetch degradation.</w:t>
+        <w:rPr>
+          <w:sz w:val="21"/>
+        </w:rPr>
+        <w:t>The following areas have changed or been updated since the prior agent session:</w:t>
       </w:r>
     </w:p>
     <w:p>
@@ -212,198 +131,22 @@
         <w:pStyle w:val="ListBullet"/>
       </w:pPr>
       <w:r>
-        <w:t>**P2:**</w:t>
+        <w:rPr>
+          <w:sz w:val="21"/>
+        </w:rPr>
       </w:r>
-    </w:p>
-    <w:p>
       <w:r>
-        <w:t xml:space="preserve">  - Define product analytics events (activation, weekly retention, milestone completion rate).</w:t>
+        <w:rPr>
+          <w:b/>
+          <w:sz w:val="21"/>
+        </w:rPr>
+        <w:t>Auth exception handling partially hardened</w:t>
       </w:r>
-    </w:p>
-    <w:p/>
-    <w:p/>
-    <w:p/>
-    <w:p>
-      <w:pPr>
-        <w:pStyle w:val="Heading2"/>
-      </w:pPr>
       <w:r>
-        <w:t>2) Senior Software Engineer Review</w:t>
-      </w:r>
-    </w:p>
-    <w:p/>
-    <w:p>
-      <w:pPr>
-        <w:pStyle w:val="Heading3"/>
-      </w:pPr>
-      <w:r>
-        <w:t>Engineering strengths</w:t>
-      </w:r>
-    </w:p>
-    <w:p/>
-    <w:p>
-      <w:r>
-        <w:t xml:space="preserve">1. **Clean backend layering and typed contracts**  </w:t>
-      </w:r>
-    </w:p>
-    <w:p>
-      <w:r>
-        <w:t xml:space="preserve">   Good separation of concerns across `main.py`, `auth.py`, `ai_utils.py`, `schemas.py`, and `models.py`.</w:t>
-      </w:r>
-    </w:p>
-    <w:p/>
-    <w:p>
-      <w:r>
-        <w:t>2. **Reasonable security foundations**</w:t>
-      </w:r>
-    </w:p>
-    <w:p>
-      <w:r>
-        <w:t xml:space="preserve">   - JWT verification with JWKS fetch/caching (`apps/api/auth.py`)</w:t>
-      </w:r>
-    </w:p>
-    <w:p>
-      <w:r>
-        <w:t xml:space="preserve">   - Auth checks enforced per route ownership in backend endpoints (`apps/api/main.py`)</w:t>
-      </w:r>
-    </w:p>
-    <w:p>
-      <w:r>
-        <w:t xml:space="preserve">   - CORS configured from env (`apps/api/main.py`)</w:t>
-      </w:r>
-    </w:p>
-    <w:p/>
-    <w:p>
-      <w:r>
-        <w:t xml:space="preserve">3. **AI output schema constraints are present**  </w:t>
-      </w:r>
-    </w:p>
-    <w:p>
-      <w:r>
-        <w:t xml:space="preserve">   Gemini responses are validated through Pydantic schemas (`apps/api/ai_utils.py`, `apps/api/schemas.py`), reducing malformed-output risk.</w:t>
-      </w:r>
-    </w:p>
-    <w:p/>
-    <w:p>
-      <w:r>
-        <w:t xml:space="preserve">4. **Backend test suite exists and is meaningful**  </w:t>
-      </w:r>
-    </w:p>
-    <w:p>
-      <w:r>
-        <w:t xml:space="preserve">   API integration tests in `apps/api/tests` cover key goal/task/milestone flows.</w:t>
-      </w:r>
-    </w:p>
-    <w:p/>
-    <w:p>
-      <w:pPr>
-        <w:pStyle w:val="Heading3"/>
-      </w:pPr>
-      <w:r>
-        <w:t>Engineering issues and improvement opportunities</w:t>
-      </w:r>
-    </w:p>
-    <w:p/>
-    <w:p>
-      <w:r>
-        <w:t xml:space="preserve">1. **`auth.py` uses broad exception catch in token decode path**  </w:t>
-      </w:r>
-    </w:p>
-    <w:p>
-      <w:r>
-        <w:t xml:space="preserve">   `except Exception` in `_decode_token` (`apps/api/auth.py`) can hide root causes and reduce observability.</w:t>
-      </w:r>
-    </w:p>
-    <w:p/>
-    <w:p>
-      <w:r>
-        <w:t xml:space="preserve">2. **Rate-limit keying strategy can cause noisy-neighbor effects**  </w:t>
-      </w:r>
-    </w:p>
-    <w:p>
-      <w:r>
-        <w:t xml:space="preserve">   `_user_key` uses `path_params.user_id` fallback to remote address (`apps/api/main.py`). This can be gamed by path variance and can cluster users behind shared IPs.</w:t>
-      </w:r>
-    </w:p>
-    <w:p/>
-    <w:p>
-      <w:r>
-        <w:t>3. **Frontend reliability and maintainability pressure**</w:t>
-      </w:r>
-    </w:p>
-    <w:p>
-      <w:r>
-        <w:t xml:space="preserve">   - Monolithic component (`Dashboard.tsx`) with mixed concerns.</w:t>
-      </w:r>
-    </w:p>
-    <w:p>
-      <w:r>
-        <w:t xml:space="preserve">   - Optimistic updates for task completion with rollback logic are present, but state complexity is high.</w:t>
-      </w:r>
-    </w:p>
-    <w:p>
-      <w:r>
-        <w:t xml:space="preserve">   - Repeated data-fetch patterns across dashboard/analytics could be centralized.</w:t>
-      </w:r>
-    </w:p>
-    <w:p/>
-    <w:p>
-      <w:r>
-        <w:t>4. **API scalability and resilience**</w:t>
-      </w:r>
-    </w:p>
-    <w:p>
-      <w:r>
-        <w:t xml:space="preserve">   - No pagination in goals listing.</w:t>
-      </w:r>
-    </w:p>
-    <w:p>
-      <w:r>
-        <w:t xml:space="preserve">   - Background task generation uses `asyncio.create_task` and logs errors, but no durable retry queue/mechanism.</w:t>
-      </w:r>
-    </w:p>
-    <w:p/>
-    <w:p>
-      <w:r>
-        <w:t>5. **Test and quality asymmetry**</w:t>
-      </w:r>
-    </w:p>
-    <w:p>
-      <w:r>
-        <w:t xml:space="preserve">   - Backend has tests; frontend has none.</w:t>
-      </w:r>
-    </w:p>
-    <w:p>
-      <w:r>
-        <w:t xml:space="preserve">   - CI runs lint/type-check/build for web and tests for API, which is good, but frontend behavior regressions remain largely unguarded.</w:t>
-      </w:r>
-    </w:p>
-    <w:p/>
-    <w:p>
-      <w:pPr>
-        <w:pStyle w:val="Heading3"/>
-      </w:pPr>
-      <w:r>
-        <w:t>Recommended technical roadmap</w:t>
-      </w:r>
-    </w:p>
-    <w:p/>
-    <w:p>
-      <w:pPr>
-        <w:pStyle w:val="ListBullet"/>
-      </w:pPr>
-      <w:r>
-        <w:t>**P0 hardening**</w:t>
-      </w:r>
-    </w:p>
-    <w:p>
-      <w:r>
-        <w:t xml:space="preserve">  - Replace broad auth exception handling with narrower exception classes and structured logging.</w:t>
-      </w:r>
-    </w:p>
-    <w:p>
-      <w:r>
-        <w:t xml:space="preserve">  - Add frontend tests for highest-risk interactions.</w:t>
+        <w:rPr>
+          <w:sz w:val="21"/>
+        </w:rPr>
+        <w:t xml:space="preserve"> — _decode_token in auth.py now catches jwt.ExpiredSignatureError and jwt.InvalidTokenError specifically, in addition to the existing broad fallback. This is a positive improvement, though a final broad catch-all remains.</w:t>
       </w:r>
     </w:p>
     <w:p>
@@ -411,17 +154,22 @@
         <w:pStyle w:val="ListBullet"/>
       </w:pPr>
       <w:r>
-        <w:t>**P1 architecture**</w:t>
+        <w:rPr>
+          <w:sz w:val="21"/>
+        </w:rPr>
       </w:r>
-    </w:p>
-    <w:p>
       <w:r>
-        <w:t xml:space="preserve">  - Refactor `Dashboard.tsx` into domain-focused components/hooks.</w:t>
+        <w:rPr>
+          <w:b/>
+          <w:sz w:val="21"/>
+        </w:rPr>
+        <w:t>Dependency updates</w:t>
       </w:r>
-    </w:p>
-    <w:p>
       <w:r>
-        <w:t xml:space="preserve">  - Introduce shared data-fetch hooks (goals/profile) to remove duplication.</w:t>
+        <w:rPr>
+          <w:sz w:val="21"/>
+        </w:rPr>
+        <w:t xml:space="preserve"> — Frontend dependencies have been updated: React 19, Vite 7, TypeScript 5.9, Tailwind CSS v4, axios 1.13.6 (apps/web/package.json).</w:t>
       </w:r>
     </w:p>
     <w:p>
@@ -429,58 +177,22 @@
         <w:pStyle w:val="ListBullet"/>
       </w:pPr>
       <w:r>
-        <w:t>**P2 performance/scale**</w:t>
+        <w:rPr>
+          <w:sz w:val="21"/>
+        </w:rPr>
       </w:r>
-    </w:p>
-    <w:p>
       <w:r>
-        <w:t xml:space="preserve">  - Add cursor/offset pagination for `/users/{user_id}/goals`.</w:t>
+        <w:rPr>
+          <w:b/>
+          <w:sz w:val="21"/>
+        </w:rPr>
+        <w:t>No new frontend tests added</w:t>
       </w:r>
-    </w:p>
-    <w:p>
       <w:r>
-        <w:t xml:space="preserve">  - Add observability metrics for AI generation latency/failure rate.</w:t>
-      </w:r>
-    </w:p>
-    <w:p/>
-    <w:p/>
-    <w:p/>
-    <w:p>
-      <w:pPr>
-        <w:pStyle w:val="Heading2"/>
-      </w:pPr>
-      <w:r>
-        <w:t>3) Current Validation Snapshot</w:t>
-      </w:r>
-    </w:p>
-    <w:p/>
-    <w:p>
-      <w:r>
-        <w:t>Commands executed in this review:</w:t>
-      </w:r>
-    </w:p>
-    <w:p/>
-    <w:p>
-      <w:pPr>
-        <w:pStyle w:val="ListBullet"/>
-      </w:pPr>
-      <w:r>
-        <w:t>Frontend baseline:</w:t>
-      </w:r>
-    </w:p>
-    <w:p>
-      <w:r>
-        <w:t xml:space="preserve">  - `npm ci`</w:t>
-      </w:r>
-    </w:p>
-    <w:p>
-      <w:r>
-        <w:t xml:space="preserve">  - `npm run lint`</w:t>
-      </w:r>
-    </w:p>
-    <w:p>
-      <w:r>
-        <w:t xml:space="preserve">  - `npm run build`</w:t>
+        <w:rPr>
+          <w:sz w:val="21"/>
+        </w:rPr>
+        <w:t xml:space="preserve"> — The testing gap identified in the prior review remains.</w:t>
       </w:r>
     </w:p>
     <w:p>
@@ -488,27 +200,22 @@
         <w:pStyle w:val="ListBullet"/>
       </w:pPr>
       <w:r>
-        <w:t>Backend baseline:</w:t>
+        <w:rPr>
+          <w:sz w:val="21"/>
+        </w:rPr>
       </w:r>
-    </w:p>
-    <w:p>
       <w:r>
-        <w:t xml:space="preserve">  - `python -m pytest -q` (passes when run with `RATE_LIMIT_ENABLED=false` and a test `GEMINI_API_KEY`)</w:t>
+        <w:rPr>
+          <w:b/>
+          <w:sz w:val="21"/>
+        </w:rPr>
+        <w:t>Dashboard.tsx remains monolithic</w:t>
       </w:r>
-    </w:p>
-    <w:p/>
-    <w:p>
       <w:r>
-        <w:t>Observed status:</w:t>
-      </w:r>
-    </w:p>
-    <w:p/>
-    <w:p>
-      <w:pPr>
-        <w:pStyle w:val="ListBullet"/>
-      </w:pPr>
-      <w:r>
-        <w:t>Frontend lint/build: ✅ pass</w:t>
+        <w:rPr>
+          <w:sz w:val="21"/>
+        </w:rPr>
+        <w:t xml:space="preserve"> — 951 lines with no decomposition.</w:t>
       </w:r>
     </w:p>
     <w:p>
@@ -516,56 +223,1263 @@
         <w:pStyle w:val="ListBullet"/>
       </w:pPr>
       <w:r>
-        <w:t>Backend tests: ✅ pass under CI-like env configuration</w:t>
+        <w:rPr>
+          <w:sz w:val="21"/>
+        </w:rPr>
+      </w:r>
+      <w:r>
+        <w:rPr>
+          <w:b/>
+          <w:sz w:val="21"/>
+        </w:rPr>
+        <w:t>No pagination added</w:t>
+      </w:r>
+      <w:r>
+        <w:rPr>
+          <w:sz w:val="21"/>
+        </w:rPr>
+        <w:t xml:space="preserve"> — Goals listing API still returns all records without limits.</w:t>
       </w:r>
     </w:p>
-    <w:p/>
-    <w:p/>
-    <w:p/>
+    <w:p>
+      <w:r>
+        <w:rPr>
+          <w:sz w:val="21"/>
+        </w:rPr>
+        <w:t xml:space="preserve">New findings discovered in this review are identified with </w:t>
+      </w:r>
+      <w:r>
+        <w:rPr>
+          <w:b/>
+          <w:sz w:val="21"/>
+        </w:rPr>
+        <w:t>[NEW]</w:t>
+      </w:r>
+      <w:r>
+        <w:rPr>
+          <w:sz w:val="21"/>
+        </w:rPr>
+        <w:t xml:space="preserve"> below.</w:t>
+      </w:r>
+    </w:p>
+    <w:p>
+      <w:pPr>
+        <w:pStyle w:val="Heading1"/>
+      </w:pPr>
+      <w:r>
+        <w:rPr>
+          <w:color w:val="1A56DB"/>
+          <w:sz w:val="32"/>
+        </w:rPr>
+        <w:t>1) Lead Product Manager Review</w:t>
+      </w:r>
+    </w:p>
     <w:p>
       <w:pPr>
         <w:pStyle w:val="Heading2"/>
       </w:pPr>
       <w:r>
-        <w:t>4) Executive Summary</w:t>
+        <w:rPr>
+          <w:color w:val="333333"/>
+          <w:sz w:val="26"/>
+        </w:rPr>
+        <w:t>Product Strengths</w:t>
       </w:r>
     </w:p>
-    <w:p/>
     <w:p>
+      <w:pPr>
+        <w:pStyle w:val="ListBullet"/>
+      </w:pPr>
       <w:r>
-        <w:t xml:space="preserve">GoalForge is already in a **strong MVP-to-beta shape**: coherent product loop, good backend structure, and working CI checks.  </w:t>
+        <w:rPr>
+          <w:sz w:val="21"/>
+        </w:rPr>
+      </w:r>
+      <w:r>
+        <w:rPr>
+          <w:b/>
+          <w:sz w:val="21"/>
+        </w:rPr>
+        <w:t>Clear core value proposition</w:t>
+      </w:r>
+      <w:r>
+        <w:rPr>
+          <w:sz w:val="21"/>
+        </w:rPr>
+        <w:t xml:space="preserve"> — GoalForge has a differentiated loop: AI-generated SMART goals + sprint tasks + gamification (README.md, dashboard/analytics UX).</w:t>
+      </w:r>
+    </w:p>
+    <w:p>
+      <w:pPr>
+        <w:pStyle w:val="ListBullet"/>
+      </w:pPr>
+      <w:r>
+        <w:rPr>
+          <w:sz w:val="21"/>
+        </w:rPr>
+      </w:r>
+      <w:r>
+        <w:rPr>
+          <w:b/>
+          <w:sz w:val="21"/>
+        </w:rPr>
+        <w:t>Coherent motivational system</w:t>
+      </w:r>
+      <w:r>
+        <w:rPr>
+          <w:sz w:val="21"/>
+        </w:rPr>
+        <w:t xml:space="preserve"> — Star points, streaks, evolution stages, and 'Hall of Fame' are implemented end-to-end and visible in UX (Dashboard.tsx, Analytics.tsx).</w:t>
+      </w:r>
+    </w:p>
+    <w:p>
+      <w:pPr>
+        <w:pStyle w:val="ListBullet"/>
+      </w:pPr>
+      <w:r>
+        <w:rPr>
+          <w:sz w:val="21"/>
+        </w:rPr>
+      </w:r>
+      <w:r>
+        <w:rPr>
+          <w:b/>
+          <w:sz w:val="21"/>
+        </w:rPr>
+        <w:t>Foundational user journey exists</w:t>
+      </w:r>
+      <w:r>
+        <w:rPr>
+          <w:sz w:val="21"/>
+        </w:rPr>
+        <w:t xml:space="preserve"> — Sign-in/sign-up, dashboard, analytics, and protected routes are in place (App.tsx).</w:t>
+      </w:r>
+    </w:p>
+    <w:p>
+      <w:pPr>
+        <w:pStyle w:val="ListBullet"/>
+      </w:pPr>
+      <w:r>
+        <w:rPr>
+          <w:sz w:val="21"/>
+        </w:rPr>
+      </w:r>
+      <w:r>
+        <w:rPr>
+          <w:b/>
+          <w:sz w:val="21"/>
+        </w:rPr>
+        <w:t>[NEW] Active dependency maintenance</w:t>
+      </w:r>
+      <w:r>
+        <w:rPr>
+          <w:sz w:val="21"/>
+        </w:rPr>
+        <w:t xml:space="preserve"> — Frontend dependencies are kept current (React 19, Vite 7, TypeScript 5.9), signaling an actively maintained project with low technical debt accumulation in the dependency layer.</w:t>
+      </w:r>
+    </w:p>
+    <w:p>
+      <w:pPr>
+        <w:pStyle w:val="Heading2"/>
+      </w:pPr>
+      <w:r>
+        <w:rPr>
+          <w:color w:val="333333"/>
+          <w:sz w:val="26"/>
+        </w:rPr>
+        <w:t>Product Risks / Gaps</w:t>
+      </w:r>
+    </w:p>
+    <w:p>
+      <w:pPr>
+        <w:pStyle w:val="ListBullet"/>
+      </w:pPr>
+      <w:r>
+        <w:rPr>
+          <w:sz w:val="21"/>
+        </w:rPr>
+      </w:r>
+      <w:r>
+        <w:rPr>
+          <w:b/>
+          <w:sz w:val="21"/>
+        </w:rPr>
+        <w:t>High feature concentration in one UI file slows iteration velocity</w:t>
+      </w:r>
+      <w:r>
+        <w:rPr>
+          <w:sz w:val="21"/>
+        </w:rPr>
+        <w:t xml:space="preserve"> — Dashboard behavior and rendering are concentrated in one large page component (Dashboard.tsx, 951 lines), increasing regression risk for roadmap delivery.</w:t>
+      </w:r>
+    </w:p>
+    <w:p>
+      <w:pPr>
+        <w:pStyle w:val="ListBullet"/>
+      </w:pPr>
+      <w:r>
+        <w:rPr>
+          <w:sz w:val="21"/>
+        </w:rPr>
+      </w:r>
+      <w:r>
+        <w:rPr>
+          <w:b/>
+          <w:sz w:val="21"/>
+        </w:rPr>
+        <w:t>No frontend automated tests</w:t>
+      </w:r>
+      <w:r>
+        <w:rPr>
+          <w:sz w:val="21"/>
+        </w:rPr>
+        <w:t xml:space="preserve"> — There are backend tests, but no frontend tests in apps/web/src, limiting release confidence for UX changes.</w:t>
+      </w:r>
+    </w:p>
+    <w:p>
+      <w:pPr>
+        <w:pStyle w:val="ListBullet"/>
+      </w:pPr>
+      <w:r>
+        <w:rPr>
+          <w:sz w:val="21"/>
+        </w:rPr>
+      </w:r>
+      <w:r>
+        <w:rPr>
+          <w:b/>
+          <w:sz w:val="21"/>
+        </w:rPr>
+        <w:t>Scalability gap in goal listing API</w:t>
+      </w:r>
+      <w:r>
+        <w:rPr>
+          <w:sz w:val="21"/>
+        </w:rPr>
+        <w:t xml:space="preserve"> — Goals API currently returns all goals without pagination (apps/api/main.py, list_goals), which can degrade UX and performance for heavy users.</w:t>
+      </w:r>
+    </w:p>
+    <w:p>
+      <w:pPr>
+        <w:pStyle w:val="ListBullet"/>
+      </w:pPr>
+      <w:r>
+        <w:rPr>
+          <w:sz w:val="21"/>
+        </w:rPr>
+      </w:r>
+      <w:r>
+        <w:rPr>
+          <w:b/>
+          <w:sz w:val="21"/>
+        </w:rPr>
+        <w:t>Operational reliability mismatch between local and CI defaults</w:t>
+      </w:r>
+      <w:r>
+        <w:rPr>
+          <w:sz w:val="21"/>
+        </w:rPr>
+        <w:t xml:space="preserve"> — Local backend tests can fail unless rate limiting is disabled via env override, while CI explicitly sets RATE_LIMIT_ENABLED=false (.github/workflows/ci.yml).</w:t>
+      </w:r>
+    </w:p>
+    <w:p>
+      <w:pPr>
+        <w:spacing w:before="120" w:after="120"/>
+        <w:ind w:left="432"/>
+      </w:pPr>
+      <w:r>
+        <w:rPr>
+          <w:b/>
+          <w:color w:val="CC0000"/>
+          <w:sz w:val="21"/>
+        </w:rPr>
+        <w:t xml:space="preserve">⚠ [NEW] P0 BUG — Silent sprint generation failure on milestone advance: </w:t>
+      </w:r>
+      <w:r>
+        <w:rPr>
+          <w:sz w:val="21"/>
+        </w:rPr>
+        <w:t>In complete_milestone (apps/api/main.py, line 657), synchronous sprint task generation catches ValueError but generate_sprint_tasks raises AIGenerationError. This mismatch means AI generation errors during milestone advancement bubble up as unhandled 500 responses rather than actionable 502 error messages.</w:t>
+      </w:r>
+    </w:p>
+    <w:p>
+      <w:pPr>
+        <w:pStyle w:val="Heading2"/>
+      </w:pPr>
+      <w:r>
+        <w:rPr>
+          <w:color w:val="333333"/>
+          <w:sz w:val="26"/>
+        </w:rPr>
+        <w:t>PM Priority Recommendations</w:t>
+      </w:r>
+    </w:p>
+    <w:p>
+      <w:pPr>
+        <w:pStyle w:val="Heading3"/>
+      </w:pPr>
+      <w:r>
+        <w:rPr>
+          <w:color w:val="555555"/>
+          <w:sz w:val="22"/>
+        </w:rPr>
+        <w:t>P0 (next sprint)</w:t>
+      </w:r>
+    </w:p>
+    <w:p>
+      <w:pPr>
+        <w:pStyle w:val="ListBullet"/>
+      </w:pPr>
+      <w:r>
+        <w:rPr>
+          <w:sz w:val="21"/>
+        </w:rPr>
+        <w:t>Fix the wrong exception class in complete_milestone (catches ValueError instead of AIGenerationError) to restore correct error messaging when sprint generation fails.</w:t>
+      </w:r>
+    </w:p>
+    <w:p>
+      <w:pPr>
+        <w:pStyle w:val="ListBullet"/>
+      </w:pPr>
+      <w:r>
+        <w:rPr>
+          <w:sz w:val="21"/>
+        </w:rPr>
+        <w:t>Add frontend test baseline for critical flows (goal creation, task completion, status update).</w:t>
+      </w:r>
+    </w:p>
+    <w:p>
+      <w:pPr>
+        <w:pStyle w:val="ListBullet"/>
+      </w:pPr>
+      <w:r>
+        <w:rPr>
+          <w:sz w:val="21"/>
+        </w:rPr>
+        <w:t>Split Dashboard into composable feature components to reduce delivery risk.</w:t>
+      </w:r>
+    </w:p>
+    <w:p>
+      <w:pPr>
+        <w:pStyle w:val="Heading3"/>
+      </w:pPr>
+      <w:r>
+        <w:rPr>
+          <w:color w:val="555555"/>
+          <w:sz w:val="22"/>
+        </w:rPr>
+        <w:t>P1</w:t>
+      </w:r>
+    </w:p>
+    <w:p>
+      <w:pPr>
+        <w:pStyle w:val="ListBullet"/>
+      </w:pPr>
+      <w:r>
+        <w:rPr>
+          <w:sz w:val="21"/>
+        </w:rPr>
+        <w:t>Add paginated goals listing and front-end support.</w:t>
+      </w:r>
+    </w:p>
+    <w:p>
+      <w:pPr>
+        <w:pStyle w:val="ListBullet"/>
+      </w:pPr>
+      <w:r>
+        <w:rPr>
+          <w:sz w:val="21"/>
+        </w:rPr>
+        <w:t>Add explicit failure UX for profile/AI-related fetch degradation.</w:t>
+      </w:r>
+    </w:p>
+    <w:p>
+      <w:pPr>
+        <w:pStyle w:val="ListBullet"/>
+      </w:pPr>
+      <w:r>
+        <w:rPr>
+          <w:sz w:val="21"/>
+        </w:rPr>
+        <w:t>Migrate FastAPI startup handler from deprecated on_event to lifespan pattern.</w:t>
+      </w:r>
+    </w:p>
+    <w:p>
+      <w:pPr>
+        <w:pStyle w:val="Heading3"/>
+      </w:pPr>
+      <w:r>
+        <w:rPr>
+          <w:color w:val="555555"/>
+          <w:sz w:val="22"/>
+        </w:rPr>
+        <w:t>P2</w:t>
+      </w:r>
+    </w:p>
+    <w:p>
+      <w:pPr>
+        <w:pStyle w:val="ListBullet"/>
+      </w:pPr>
+      <w:r>
+        <w:rPr>
+          <w:sz w:val="21"/>
+        </w:rPr>
+        <w:t>Define product analytics events (activation, weekly retention, milestone completion rate).</w:t>
+      </w:r>
+    </w:p>
+    <w:p>
+      <w:pPr>
+        <w:pStyle w:val="Heading1"/>
+      </w:pPr>
+      <w:r>
+        <w:rPr>
+          <w:color w:val="1A56DB"/>
+          <w:sz w:val="32"/>
+        </w:rPr>
+        <w:t>2) Senior Software Engineer Review</w:t>
+      </w:r>
+    </w:p>
+    <w:p>
+      <w:pPr>
+        <w:pStyle w:val="Heading2"/>
+      </w:pPr>
+      <w:r>
+        <w:rPr>
+          <w:color w:val="333333"/>
+          <w:sz w:val="26"/>
+        </w:rPr>
+        <w:t>Engineering Strengths</w:t>
+      </w:r>
+    </w:p>
+    <w:p>
+      <w:pPr>
+        <w:pStyle w:val="ListBullet"/>
+      </w:pPr>
+      <w:r>
+        <w:rPr>
+          <w:sz w:val="21"/>
+        </w:rPr>
+      </w:r>
+      <w:r>
+        <w:rPr>
+          <w:b/>
+          <w:sz w:val="21"/>
+        </w:rPr>
+        <w:t>Clean backend layering and typed contracts</w:t>
+      </w:r>
+      <w:r>
+        <w:rPr>
+          <w:sz w:val="21"/>
+        </w:rPr>
+        <w:t xml:space="preserve"> — Good separation of concerns across main.py, auth.py, ai_utils.py, schemas.py, and models.py.</w:t>
+      </w:r>
+    </w:p>
+    <w:p>
+      <w:pPr>
+        <w:pStyle w:val="ListBullet"/>
+      </w:pPr>
+      <w:r>
+        <w:rPr>
+          <w:sz w:val="21"/>
+        </w:rPr>
+      </w:r>
+      <w:r>
+        <w:rPr>
+          <w:b/>
+          <w:sz w:val="21"/>
+        </w:rPr>
+        <w:t>[NEW] Improved auth exception specificity</w:t>
+      </w:r>
+      <w:r>
+        <w:rPr>
+          <w:sz w:val="21"/>
+        </w:rPr>
+        <w:t xml:space="preserve"> — _decode_token in auth.py now explicitly catches jwt.ExpiredSignatureError and jwt.InvalidTokenError, enabling differentiated error responses and improved observability.</w:t>
+      </w:r>
+    </w:p>
+    <w:p>
+      <w:pPr>
+        <w:pStyle w:val="ListBullet"/>
+      </w:pPr>
+      <w:r>
+        <w:rPr>
+          <w:sz w:val="21"/>
+        </w:rPr>
+      </w:r>
+      <w:r>
+        <w:rPr>
+          <w:b/>
+          <w:sz w:val="21"/>
+        </w:rPr>
+        <w:t>Reasonable security foundations</w:t>
+      </w:r>
+      <w:r>
+        <w:rPr>
+          <w:sz w:val="21"/>
+        </w:rPr>
+        <w:t xml:space="preserve"> — JWT verification with JWKS fetch/caching (auth.py); auth checks enforced per route ownership; CORS configured from env.</w:t>
+      </w:r>
+    </w:p>
+    <w:p>
+      <w:pPr>
+        <w:pStyle w:val="ListBullet"/>
+      </w:pPr>
+      <w:r>
+        <w:rPr>
+          <w:sz w:val="21"/>
+        </w:rPr>
+      </w:r>
+      <w:r>
+        <w:rPr>
+          <w:b/>
+          <w:sz w:val="21"/>
+        </w:rPr>
+        <w:t>AI output schema constraints are present</w:t>
+      </w:r>
+      <w:r>
+        <w:rPr>
+          <w:sz w:val="21"/>
+        </w:rPr>
+        <w:t xml:space="preserve"> — Gemini responses are validated through Pydantic schemas (ai_utils.py, schemas.py), reducing malformed-output risk.</w:t>
+      </w:r>
+    </w:p>
+    <w:p>
+      <w:pPr>
+        <w:pStyle w:val="ListBullet"/>
+      </w:pPr>
+      <w:r>
+        <w:rPr>
+          <w:sz w:val="21"/>
+        </w:rPr>
+      </w:r>
+      <w:r>
+        <w:rPr>
+          <w:b/>
+          <w:sz w:val="21"/>
+        </w:rPr>
+        <w:t>Backend test suite is healthy</w:t>
+      </w:r>
+      <w:r>
+        <w:rPr>
+          <w:sz w:val="21"/>
+        </w:rPr>
+        <w:t xml:space="preserve"> — API integration tests in apps/api/tests cover key goal/task/milestone flows — 23 tests, all passing.</w:t>
+      </w:r>
+    </w:p>
+    <w:p>
+      <w:pPr>
+        <w:pStyle w:val="ListBullet"/>
+      </w:pPr>
+      <w:r>
+        <w:rPr>
+          <w:sz w:val="21"/>
+        </w:rPr>
+      </w:r>
+      <w:r>
+        <w:rPr>
+          <w:b/>
+          <w:sz w:val="21"/>
+        </w:rPr>
+        <w:t>[NEW] CI pipeline is comprehensive</w:t>
+      </w:r>
+      <w:r>
+        <w:rPr>
+          <w:sz w:val="21"/>
+        </w:rPr>
+        <w:t xml:space="preserve"> — The CI workflow runs backend tests plus frontend lint, TypeScript type check, and build on every push and PR.</w:t>
+      </w:r>
+    </w:p>
+    <w:p>
+      <w:pPr>
+        <w:pStyle w:val="Heading2"/>
+      </w:pPr>
+      <w:r>
+        <w:rPr>
+          <w:color w:val="333333"/>
+          <w:sz w:val="26"/>
+        </w:rPr>
+        <w:t>Engineering Issues and Improvement Opportunities</w:t>
+      </w:r>
+    </w:p>
+    <w:p>
+      <w:pPr>
+        <w:spacing w:before="120" w:after="120"/>
+        <w:ind w:left="432"/>
+      </w:pPr>
+      <w:r>
+        <w:rPr>
+          <w:b/>
+          <w:color w:val="CC0000"/>
+          <w:sz w:val="21"/>
+        </w:rPr>
+        <w:t xml:space="preserve">⚠ [NEW] BUG: Wrong exception caught in complete_milestone: </w:t>
+      </w:r>
+      <w:r>
+        <w:rPr>
+          <w:sz w:val="21"/>
+        </w:rPr>
+        <w:t>At apps/api/main.py line 657, 'except ValueError as exc:' should be 'except AIGenerationError as exc:'. The generate_sprint_tasks function raises AIGenerationError (defined in exceptions.py), never ValueError. Sync generation failures propagate as unhandled 500 Internal Server Errors instead of the intended 502.</w:t>
+      </w:r>
+    </w:p>
+    <w:p>
+      <w:pPr>
+        <w:ind w:left="432"/>
+      </w:pPr>
+      <w:r>
+        <w:rPr>
+          <w:rFonts w:ascii="Consolas" w:hAnsi="Consolas"/>
+          <w:color w:val="444444"/>
+          <w:sz w:val="18"/>
+        </w:rPr>
+        <w:t># Current (broken):</w:t>
+      </w:r>
+    </w:p>
+    <w:p>
+      <w:pPr>
+        <w:ind w:left="432"/>
+      </w:pPr>
+      <w:r>
+        <w:rPr>
+          <w:rFonts w:ascii="Consolas" w:hAnsi="Consolas"/>
+          <w:color w:val="444444"/>
+          <w:sz w:val="18"/>
+        </w:rPr>
+        <w:t>except ValueError as exc:</w:t>
+      </w:r>
+    </w:p>
+    <w:p>
+      <w:pPr>
+        <w:ind w:left="432"/>
+      </w:pPr>
+      <w:r>
+        <w:rPr>
+          <w:rFonts w:ascii="Consolas" w:hAnsi="Consolas"/>
+          <w:color w:val="444444"/>
+          <w:sz w:val="18"/>
+        </w:rPr>
+        <w:t xml:space="preserve">    raise HTTPException(status_code=502, detail=str(exc))</w:t>
+      </w:r>
+    </w:p>
+    <w:p>
+      <w:pPr>
+        <w:ind w:left="432"/>
+      </w:pPr>
+      <w:r>
+        <w:rPr>
+          <w:rFonts w:ascii="Consolas" w:hAnsi="Consolas"/>
+          <w:color w:val="444444"/>
+          <w:sz w:val="18"/>
+        </w:rPr>
+      </w:r>
+    </w:p>
+    <w:p>
+      <w:pPr>
+        <w:ind w:left="432"/>
+      </w:pPr>
+      <w:r>
+        <w:rPr>
+          <w:rFonts w:ascii="Consolas" w:hAnsi="Consolas"/>
+          <w:color w:val="444444"/>
+          <w:sz w:val="18"/>
+        </w:rPr>
+        <w:t># Should be:</w:t>
+      </w:r>
+    </w:p>
+    <w:p>
+      <w:pPr>
+        <w:ind w:left="432"/>
+      </w:pPr>
+      <w:r>
+        <w:rPr>
+          <w:rFonts w:ascii="Consolas" w:hAnsi="Consolas"/>
+          <w:color w:val="444444"/>
+          <w:sz w:val="18"/>
+        </w:rPr>
+        <w:t>except AIGenerationError as exc:</w:t>
+      </w:r>
+    </w:p>
+    <w:p>
+      <w:pPr>
+        <w:ind w:left="432"/>
+      </w:pPr>
+      <w:r>
+        <w:rPr>
+          <w:rFonts w:ascii="Consolas" w:hAnsi="Consolas"/>
+          <w:color w:val="444444"/>
+          <w:sz w:val="18"/>
+        </w:rPr>
+        <w:t xml:space="preserve">    raise HTTPException(status_code=502, detail=str(exc))</w:t>
+      </w:r>
+    </w:p>
+    <w:p>
+      <w:pPr>
+        <w:pStyle w:val="ListBullet"/>
+      </w:pPr>
+      <w:r>
+        <w:rPr>
+          <w:sz w:val="21"/>
+        </w:rPr>
+      </w:r>
+      <w:r>
+        <w:rPr>
+          <w:b/>
+          <w:sz w:val="21"/>
+        </w:rPr>
+        <w:t>auth.py retains broad fallback exception in token decode path</w:t>
+      </w:r>
+      <w:r>
+        <w:rPr>
+          <w:sz w:val="21"/>
+        </w:rPr>
+        <w:t xml:space="preserve"> — While specific handlers for jwt.ExpiredSignatureError and jwt.InvalidTokenError have been added, a final broad 'except Exception' fallback remains in _decode_token (auth.py, lines 105-109). This still masks unexpected failures and reduces observability.</w:t>
+      </w:r>
+    </w:p>
+    <w:p>
+      <w:pPr>
+        <w:spacing w:before="120" w:after="120"/>
+        <w:ind w:left="432"/>
+      </w:pPr>
+      <w:r>
+        <w:rPr>
+          <w:b/>
+          <w:color w:val="CC8800"/>
+          <w:sz w:val="21"/>
+        </w:rPr>
+        <w:t xml:space="preserve">⚠ [NEW] Deprecated FastAPI startup event handler: </w:t>
+      </w:r>
+      <w:r>
+        <w:rPr>
+          <w:sz w:val="21"/>
+        </w:rPr>
+        <w:t>@app.on_event('startup') in apps/api/main.py (line 94) is deprecated in FastAPI and emits a DeprecationWarning visible in test output. The recommended replacement is the lifespan context manager pattern.</w:t>
+      </w:r>
+    </w:p>
+    <w:p>
+      <w:pPr>
+        <w:pStyle w:val="ListBullet"/>
+      </w:pPr>
+      <w:r>
+        <w:rPr>
+          <w:sz w:val="21"/>
+        </w:rPr>
+      </w:r>
+      <w:r>
+        <w:rPr>
+          <w:b/>
+          <w:sz w:val="21"/>
+        </w:rPr>
+        <w:t>Rate-limit keying strategy can cause noisy-neighbor effects</w:t>
+      </w:r>
+      <w:r>
+        <w:rPr>
+          <w:sz w:val="21"/>
+        </w:rPr>
+        <w:t xml:space="preserve"> — _user_key uses path_params.user_id fallback to remote address (main.py). This can be gamed by path variance and can cluster users behind shared IPs.</w:t>
+      </w:r>
+    </w:p>
+    <w:p>
+      <w:pPr>
+        <w:pStyle w:val="ListBullet"/>
+      </w:pPr>
+      <w:r>
+        <w:rPr>
+          <w:sz w:val="21"/>
+        </w:rPr>
+      </w:r>
+      <w:r>
+        <w:rPr>
+          <w:b/>
+          <w:sz w:val="21"/>
+        </w:rPr>
+        <w:t>Frontend reliability and maintainability pressure</w:t>
+      </w:r>
+      <w:r>
+        <w:rPr>
+          <w:sz w:val="21"/>
+        </w:rPr>
+        <w:t xml:space="preserve"> — Monolithic component (Dashboard.tsx, 951 lines) with mixed concerns. Repeated data-fetch patterns across Dashboard.tsx and Analytics.tsx could be centralized into shared hooks.</w:t>
+      </w:r>
+    </w:p>
+    <w:p>
+      <w:pPr>
+        <w:pStyle w:val="ListBullet"/>
+      </w:pPr>
+      <w:r>
+        <w:rPr>
+          <w:sz w:val="21"/>
+        </w:rPr>
+      </w:r>
+      <w:r>
+        <w:rPr>
+          <w:b/>
+          <w:sz w:val="21"/>
+        </w:rPr>
+        <w:t>API scalability and resilience</w:t>
+      </w:r>
+      <w:r>
+        <w:rPr>
+          <w:sz w:val="21"/>
+        </w:rPr>
+        <w:t xml:space="preserve"> — No pagination in goals listing. Background task generation uses asyncio.create_task and logs errors, but no durable retry queue/mechanism.</w:t>
+      </w:r>
+    </w:p>
+    <w:p>
+      <w:pPr>
+        <w:pStyle w:val="ListBullet"/>
+      </w:pPr>
+      <w:r>
+        <w:rPr>
+          <w:sz w:val="21"/>
+        </w:rPr>
+      </w:r>
+      <w:r>
+        <w:rPr>
+          <w:b/>
+          <w:sz w:val="21"/>
+        </w:rPr>
+        <w:t>Test and quality asymmetry</w:t>
+      </w:r>
+      <w:r>
+        <w:rPr>
+          <w:sz w:val="21"/>
+        </w:rPr>
+        <w:t xml:space="preserve"> — Backend has tests; frontend has none. CI runs lint/type-check/build for web, but frontend behavior regressions remain largely unguarded.</w:t>
+      </w:r>
+    </w:p>
+    <w:p>
+      <w:pPr>
+        <w:pStyle w:val="Heading2"/>
+      </w:pPr>
+      <w:r>
+        <w:rPr>
+          <w:color w:val="333333"/>
+          <w:sz w:val="26"/>
+        </w:rPr>
+        <w:t>Recommended Technical Roadmap</w:t>
+      </w:r>
+    </w:p>
+    <w:p>
+      <w:pPr>
+        <w:pStyle w:val="Heading3"/>
+      </w:pPr>
+      <w:r>
+        <w:rPr>
+          <w:color w:val="555555"/>
+          <w:sz w:val="22"/>
+        </w:rPr>
+        <w:t>P0 hardening (immediate)</w:t>
+      </w:r>
+    </w:p>
+    <w:p>
+      <w:pPr>
+        <w:pStyle w:val="ListBullet"/>
+      </w:pPr>
+      <w:r>
+        <w:rPr>
+          <w:sz w:val="21"/>
+        </w:rPr>
+        <w:t>Fix complete_milestone: change 'except ValueError' to 'except AIGenerationError' to restore correct error handling.</w:t>
+      </w:r>
+    </w:p>
+    <w:p>
+      <w:pPr>
+        <w:pStyle w:val="ListBullet"/>
+      </w:pPr>
+      <w:r>
+        <w:rPr>
+          <w:sz w:val="21"/>
+        </w:rPr>
+        <w:t>Remove or scope the remaining broad 'except Exception' fallback in _decode_token; add structured logging.</w:t>
+      </w:r>
+    </w:p>
+    <w:p>
+      <w:pPr>
+        <w:pStyle w:val="ListBullet"/>
+      </w:pPr>
+      <w:r>
+        <w:rPr>
+          <w:sz w:val="21"/>
+        </w:rPr>
+        <w:t>Add frontend tests for highest-risk interactions (goal creation, task completion, milestone advance).</w:t>
+      </w:r>
+    </w:p>
+    <w:p>
+      <w:pPr>
+        <w:pStyle w:val="Heading3"/>
+      </w:pPr>
+      <w:r>
+        <w:rPr>
+          <w:color w:val="555555"/>
+          <w:sz w:val="22"/>
+        </w:rPr>
+        <w:t>P1 architecture</w:t>
+      </w:r>
+    </w:p>
+    <w:p>
+      <w:pPr>
+        <w:pStyle w:val="ListBullet"/>
+      </w:pPr>
+      <w:r>
+        <w:rPr>
+          <w:sz w:val="21"/>
+        </w:rPr>
+        <w:t>Migrate @app.on_event('startup') to FastAPI lifespan pattern.</w:t>
+      </w:r>
+    </w:p>
+    <w:p>
+      <w:pPr>
+        <w:pStyle w:val="ListBullet"/>
+      </w:pPr>
+      <w:r>
+        <w:rPr>
+          <w:sz w:val="21"/>
+        </w:rPr>
+        <w:t>Refactor Dashboard.tsx into domain-focused components/hooks.</w:t>
+      </w:r>
+    </w:p>
+    <w:p>
+      <w:pPr>
+        <w:pStyle w:val="ListBullet"/>
+      </w:pPr>
+      <w:r>
+        <w:rPr>
+          <w:sz w:val="21"/>
+        </w:rPr>
+        <w:t>Introduce shared data-fetch hooks (goals/profile) to remove duplication between Dashboard and Analytics.</w:t>
+      </w:r>
+    </w:p>
+    <w:p>
+      <w:pPr>
+        <w:pStyle w:val="Heading3"/>
+      </w:pPr>
+      <w:r>
+        <w:rPr>
+          <w:color w:val="555555"/>
+          <w:sz w:val="22"/>
+        </w:rPr>
+        <w:t>P2 performance/scale</w:t>
+      </w:r>
+    </w:p>
+    <w:p>
+      <w:pPr>
+        <w:pStyle w:val="ListBullet"/>
+      </w:pPr>
+      <w:r>
+        <w:rPr>
+          <w:sz w:val="21"/>
+        </w:rPr>
+        <w:t>Add cursor/offset pagination for /users/{user_id}/goals.</w:t>
+      </w:r>
+    </w:p>
+    <w:p>
+      <w:pPr>
+        <w:pStyle w:val="ListBullet"/>
+      </w:pPr>
+      <w:r>
+        <w:rPr>
+          <w:sz w:val="21"/>
+        </w:rPr>
+        <w:t>Add observability metrics for AI generation latency/failure rate.</w:t>
+      </w:r>
+    </w:p>
+    <w:p>
+      <w:pPr>
+        <w:pStyle w:val="Heading1"/>
+      </w:pPr>
+      <w:r>
+        <w:rPr>
+          <w:color w:val="1A56DB"/>
+          <w:sz w:val="32"/>
+        </w:rPr>
+        <w:t>3) Current Validation Snapshot</w:t>
       </w:r>
     </w:p>
     <w:p>
       <w:r>
-        <w:t>The highest-leverage next work is:</w:t>
+        <w:rPr>
+          <w:sz w:val="21"/>
+        </w:rPr>
+        <w:t>Commands executed in this review (2026-03-14):</w:t>
       </w:r>
     </w:p>
-    <w:p/>
     <w:p>
+      <w:pPr>
+        <w:pStyle w:val="Heading3"/>
+      </w:pPr>
       <w:r>
-        <w:t>1. **Frontend quality uplift** (tests + dashboard decomposition),</w:t>
+        <w:rPr>
+          <w:color w:val="555555"/>
+          <w:sz w:val="22"/>
+        </w:rPr>
+        <w:t>Frontend baseline</w:t>
+      </w:r>
+    </w:p>
+    <w:p>
+      <w:pPr>
+        <w:pStyle w:val="ListBullet"/>
+      </w:pPr>
+      <w:r>
+        <w:rPr>
+          <w:sz w:val="21"/>
+        </w:rPr>
+        <w:t>npm ci</w:t>
+      </w:r>
+    </w:p>
+    <w:p>
+      <w:pPr>
+        <w:pStyle w:val="ListBullet"/>
+      </w:pPr>
+      <w:r>
+        <w:rPr>
+          <w:sz w:val="21"/>
+        </w:rPr>
+        <w:t>npm run lint — PASS (0 warnings)</w:t>
+      </w:r>
+    </w:p>
+    <w:p>
+      <w:pPr>
+        <w:pStyle w:val="ListBullet"/>
+      </w:pPr>
+      <w:r>
+        <w:rPr>
+          <w:sz w:val="21"/>
+        </w:rPr>
+        <w:t>npx tsc --noEmit — PASS</w:t>
+      </w:r>
+    </w:p>
+    <w:p>
+      <w:pPr>
+        <w:pStyle w:val="ListBullet"/>
+      </w:pPr>
+      <w:r>
+        <w:rPr>
+          <w:sz w:val="21"/>
+        </w:rPr>
+        <w:t>npm run build — PASS (323 KB JS bundle, gzip 97 KB)</w:t>
+      </w:r>
+    </w:p>
+    <w:p>
+      <w:pPr>
+        <w:pStyle w:val="Heading3"/>
+      </w:pPr>
+      <w:r>
+        <w:rPr>
+          <w:color w:val="555555"/>
+          <w:sz w:val="22"/>
+        </w:rPr>
+        <w:t>Backend baseline</w:t>
+      </w:r>
+    </w:p>
+    <w:p>
+      <w:pPr>
+        <w:pStyle w:val="ListBullet"/>
+      </w:pPr>
+      <w:r>
+        <w:rPr>
+          <w:sz w:val="21"/>
+        </w:rPr>
+        <w:t>python -m pytest tests/ -v (with RATE_LIMIT_ENABLED=false GEMINI_API_KEY=dummy DATABASE_URL=sqlite+aiosqlite:///:memory:)</w:t>
+      </w:r>
+    </w:p>
+    <w:p>
+      <w:pPr>
+        <w:pStyle w:val="Heading3"/>
+      </w:pPr>
+      <w:r>
+        <w:rPr>
+          <w:color w:val="555555"/>
+          <w:sz w:val="22"/>
+        </w:rPr>
+        <w:t>Observed status</w:t>
+      </w:r>
+    </w:p>
+    <w:p>
+      <w:pPr>
+        <w:pStyle w:val="ListBullet"/>
+      </w:pPr>
+      <w:r>
+        <w:rPr>
+          <w:sz w:val="21"/>
+        </w:rPr>
+        <w:t>Frontend lint/type-check/build: PASS</w:t>
+      </w:r>
+    </w:p>
+    <w:p>
+      <w:pPr>
+        <w:pStyle w:val="ListBullet"/>
+      </w:pPr>
+      <w:r>
+        <w:rPr>
+          <w:sz w:val="21"/>
+        </w:rPr>
+        <w:t>Backend tests: 23/23 passed (2 deprecation warnings — on_event startup handler)</w:t>
+      </w:r>
+    </w:p>
+    <w:p>
+      <w:pPr>
+        <w:pStyle w:val="Heading1"/>
+      </w:pPr>
+      <w:r>
+        <w:rPr>
+          <w:color w:val="1A56DB"/>
+          <w:sz w:val="32"/>
+        </w:rPr>
+        <w:t>4) Executive Summary</w:t>
       </w:r>
     </w:p>
     <w:p>
       <w:r>
-        <w:t>2. **Security/observability hardening in auth + rate limiting**, and</w:t>
+        <w:rPr>
+          <w:sz w:val="21"/>
+        </w:rPr>
+        <w:t xml:space="preserve">GoalForge is in a </w:t>
+      </w:r>
+      <w:r>
+        <w:rPr>
+          <w:b/>
+          <w:sz w:val="21"/>
+        </w:rPr>
+        <w:t>strong MVP-to-beta shape</w:t>
+      </w:r>
+      <w:r>
+        <w:rPr>
+          <w:sz w:val="21"/>
+        </w:rPr>
+        <w:t>: coherent product loop, good backend structure, and a comprehensive CI pipeline.</w:t>
       </w:r>
     </w:p>
     <w:p>
       <w:r>
-        <w:t>3. **Scalability guardrails** (pagination + improved async task reliability).</w:t>
+        <w:rPr>
+          <w:sz w:val="21"/>
+        </w:rPr>
+        <w:t xml:space="preserve">Since the previous review (2026-03-13), the most notable improvement is partial auth exception specificity in _decode_token. However, one new </w:t>
+      </w:r>
+      <w:r>
+        <w:rPr>
+          <w:b/>
+          <w:sz w:val="21"/>
+        </w:rPr>
+        <w:t>P0 bug</w:t>
+      </w:r>
+      <w:r>
+        <w:rPr>
+          <w:sz w:val="21"/>
+        </w:rPr>
+        <w:t xml:space="preserve"> was discovered: complete_milestone catches the wrong exception class (ValueError instead of AIGenerationError), meaning synchronous sprint generation failures during milestone advancement surface as unhandled 500 errors rather than the intended actionable 502 responses.</w:t>
       </w:r>
     </w:p>
-    <w:p/>
     <w:p>
       <w:r>
-        <w:t>These improvements can be delivered incrementally without removing existing shipped behavior.</w:t>
+        <w:rPr>
+          <w:sz w:val="21"/>
+        </w:rPr>
+        <w:t>The highest-leverage next work remains:</w:t>
+      </w:r>
+    </w:p>
+    <w:p>
+      <w:pPr>
+        <w:pStyle w:val="ListBullet"/>
+      </w:pPr>
+      <w:r>
+        <w:rPr>
+          <w:sz w:val="21"/>
+        </w:rPr>
+      </w:r>
+      <w:r>
+        <w:rPr>
+          <w:b/>
+          <w:sz w:val="21"/>
+        </w:rPr>
+        <w:t>P0 bug fix</w:t>
+      </w:r>
+      <w:r>
+        <w:rPr>
+          <w:sz w:val="21"/>
+        </w:rPr>
+        <w:t xml:space="preserve"> — correct exception class in complete_milestone</w:t>
+      </w:r>
+    </w:p>
+    <w:p>
+      <w:pPr>
+        <w:pStyle w:val="ListBullet"/>
+      </w:pPr>
+      <w:r>
+        <w:rPr>
+          <w:sz w:val="21"/>
+        </w:rPr>
+      </w:r>
+      <w:r>
+        <w:rPr>
+          <w:b/>
+          <w:sz w:val="21"/>
+        </w:rPr>
+        <w:t>Frontend quality uplift</w:t>
+      </w:r>
+      <w:r>
+        <w:rPr>
+          <w:sz w:val="21"/>
+        </w:rPr>
+        <w:t xml:space="preserve"> (tests + dashboard decomposition)</w:t>
+      </w:r>
+    </w:p>
+    <w:p>
+      <w:pPr>
+        <w:pStyle w:val="ListBullet"/>
+      </w:pPr>
+      <w:r>
+        <w:rPr>
+          <w:sz w:val="21"/>
+        </w:rPr>
+      </w:r>
+      <w:r>
+        <w:rPr>
+          <w:b/>
+          <w:sz w:val="21"/>
+        </w:rPr>
+        <w:t>Security/observability hardening</w:t>
+      </w:r>
+      <w:r>
+        <w:rPr>
+          <w:sz w:val="21"/>
+        </w:rPr>
+        <w:t xml:space="preserve"> (remove remaining broad auth fallback, migrate startup handler)</w:t>
+      </w:r>
+    </w:p>
+    <w:p>
+      <w:pPr>
+        <w:pStyle w:val="ListBullet"/>
+      </w:pPr>
+      <w:r>
+        <w:rPr>
+          <w:sz w:val="21"/>
+        </w:rPr>
+      </w:r>
+      <w:r>
+        <w:rPr>
+          <w:b/>
+          <w:sz w:val="21"/>
+        </w:rPr>
+        <w:t>Scalability guardrails</w:t>
+      </w:r>
+      <w:r>
+        <w:rPr>
+          <w:sz w:val="21"/>
+        </w:rPr>
+        <w:t xml:space="preserve"> (pagination + improved async task reliability)</w:t>
+      </w:r>
+    </w:p>
+    <w:p>
+      <w:r>
+        <w:rPr>
+          <w:sz w:val="21"/>
+        </w:rPr>
+        <w:t>All improvements can be delivered incrementally without removing existing shipped behavior.</w:t>
       </w:r>
     </w:p>
     <w:sectPr>
       <w:pgSz w:w="12240" w:h="15840"/>
-      <w:pgMar w:top="1440" w:right="1800" w:bottom="1440" w:left="1800" w:header="720" w:footer="720" w:gutter="0"/>
+      <w:pgMar w:top="1152" w:right="1440" w:bottom="1152" w:left="1440" w:header="720" w:footer="720" w:gutter="0"/>
       <w:cols w:space="720"/>
       <w:docGrid w:linePitch="360"/>
     </w:sectPr>
@@ -936,6 +1850,13 @@
     <w:name w:val="Normal"/>
     <w:qFormat/>
     <w:rsid w:val="00FC693F"/>
+    <w:pPr>
+      <w:spacing w:after="80"/>
+    </w:pPr>
+    <w:rPr>
+      <w:rFonts w:ascii="Calibri" w:hAnsi="Calibri"/>
+      <w:sz w:val="21"/>
+    </w:rPr>
   </w:style>
   <w:style w:type="paragraph" w:styleId="Header">
     <w:name w:val="header"/>

</xml_diff>

<commit_message>
Redo review against main branch (commit 7c66f88) with DOCX and PDF
Co-authored-by: Samat-ai <85476035+Samat-ai@users.noreply.github.com>
</commit_message>
<xml_diff>
--- a/PROJECT_CURRENT_STATE_REVIEW.docx
+++ b/PROJECT_CURRENT_STATE_REVIEW.docx
@@ -51,6 +51,21 @@
           <w:b/>
           <w:sz w:val="20"/>
         </w:rPr>
+        <w:t xml:space="preserve">Codebase reviewed: </w:t>
+      </w:r>
+      <w:r>
+        <w:rPr>
+          <w:sz w:val="20"/>
+        </w:rPr>
+        <w:t>main branch (commit 7c66f88)</w:t>
+      </w:r>
+    </w:p>
+    <w:p>
+      <w:r>
+        <w:rPr>
+          <w:b/>
+          <w:sz w:val="20"/>
+        </w:rPr>
         <w:t xml:space="preserve">Prior review date: </w:t>
       </w:r>
       <w:r>
@@ -81,7 +96,7 @@
         <w:rPr>
           <w:sz w:val="21"/>
         </w:rPr>
-        <w:t>Backend: apps/api (FastAPI, auth, AI orchestration, data model, tests)</w:t>
+        <w:t>Backend: apps/api (FastAPI, auth, AI orchestration, data model, tests, structured logging)</w:t>
       </w:r>
     </w:p>
     <w:p>
@@ -92,7 +107,7 @@
         <w:rPr>
           <w:sz w:val="21"/>
         </w:rPr>
-        <w:t>Frontend: apps/web (React/Vite UX, state management, API integration)</w:t>
+        <w:t>Frontend: apps/web (React/Vite UX, state management, API integration, component library)</w:t>
       </w:r>
     </w:p>
     <w:p>
@@ -103,7 +118,18 @@
         <w:rPr>
           <w:sz w:val="21"/>
         </w:rPr>
-        <w:t>CI and project setup: .github/workflows/ci.yml, root and app READMEs</w:t>
+        <w:t>Infrastructure: docker-compose.yml, apps/api/Dockerfile, apps/web/Dockerfile</w:t>
+      </w:r>
+    </w:p>
+    <w:p>
+      <w:pPr>
+        <w:pStyle w:val="ListBullet"/>
+      </w:pPr>
+      <w:r>
+        <w:rPr>
+          <w:sz w:val="21"/>
+        </w:rPr>
+        <w:t>CI pipeline: .github/workflows/ci.yml</w:t>
       </w:r>
     </w:p>
     <w:p>
@@ -123,7 +149,214 @@
         <w:rPr>
           <w:sz w:val="21"/>
         </w:rPr>
-        <w:t>The following areas have changed or been updated since the prior agent session:</w:t>
+        <w:t>The main branch has received significant improvements since the previous review:</w:t>
+      </w:r>
+    </w:p>
+    <w:p>
+      <w:pPr>
+        <w:pStyle w:val="ListBullet"/>
+      </w:pPr>
+      <w:r>
+        <w:rPr>
+          <w:sz w:val="21"/>
+        </w:rPr>
+      </w:r>
+      <w:r>
+        <w:rPr>
+          <w:b/>
+          <w:sz w:val="21"/>
+        </w:rPr>
+        <w:t>PR #28 — Error boundary added</w:t>
+      </w:r>
+      <w:r>
+        <w:rPr>
+          <w:sz w:val="21"/>
+        </w:rPr>
+        <w:t xml:space="preserve"> — ErrorBoundary component wraps routes in App.tsx, improving crash resilience.</w:t>
+      </w:r>
+    </w:p>
+    <w:p>
+      <w:pPr>
+        <w:pStyle w:val="ListBullet"/>
+      </w:pPr>
+      <w:r>
+        <w:rPr>
+          <w:sz w:val="21"/>
+        </w:rPr>
+      </w:r>
+      <w:r>
+        <w:rPr>
+          <w:b/>
+          <w:sz w:val="21"/>
+        </w:rPr>
+        <w:t>PR #29 — Goal template chips</w:t>
+      </w:r>
+      <w:r>
+        <w:rPr>
+          <w:sz w:val="21"/>
+        </w:rPr>
+        <w:t xml:space="preserve"> — AddGoal.tsx now includes template suggestions for faster goal creation.</w:t>
+      </w:r>
+    </w:p>
+    <w:p>
+      <w:pPr>
+        <w:pStyle w:val="ListBullet"/>
+      </w:pPr>
+      <w:r>
+        <w:rPr>
+          <w:sz w:val="21"/>
+        </w:rPr>
+      </w:r>
+      <w:r>
+        <w:rPr>
+          <w:b/>
+          <w:sz w:val="21"/>
+        </w:rPr>
+        <w:t>PR #30 — Settings page</w:t>
+      </w:r>
+      <w:r>
+        <w:rPr>
+          <w:sz w:val="21"/>
+        </w:rPr>
+        <w:t xml:space="preserve"> — New user settings page with timezone and display name preferences; backend endpoints at /users/{user_id}/settings.</w:t>
+      </w:r>
+    </w:p>
+    <w:p>
+      <w:pPr>
+        <w:pStyle w:val="ListBullet"/>
+      </w:pPr>
+      <w:r>
+        <w:rPr>
+          <w:sz w:val="21"/>
+        </w:rPr>
+      </w:r>
+      <w:r>
+        <w:rPr>
+          <w:b/>
+          <w:sz w:val="21"/>
+        </w:rPr>
+        <w:t>PR #31 — DB connection pooling and enhanced health check</w:t>
+      </w:r>
+      <w:r>
+        <w:rPr>
+          <w:sz w:val="21"/>
+        </w:rPr>
+        <w:t xml:space="preserve"> — Health endpoint now verifies database connectivity.</w:t>
+      </w:r>
+    </w:p>
+    <w:p>
+      <w:pPr>
+        <w:pStyle w:val="ListBullet"/>
+      </w:pPr>
+      <w:r>
+        <w:rPr>
+          <w:sz w:val="21"/>
+        </w:rPr>
+      </w:r>
+      <w:r>
+        <w:rPr>
+          <w:b/>
+          <w:sz w:val="21"/>
+        </w:rPr>
+        <w:t>PR #32 — Structured logging with request ID tracing</w:t>
+      </w:r>
+      <w:r>
+        <w:rPr>
+          <w:sz w:val="21"/>
+        </w:rPr>
+        <w:t xml:space="preserve"> — request_id_var ContextVar, JSON formatter for production, X-Request-ID response header, per-request timing.</w:t>
+      </w:r>
+    </w:p>
+    <w:p>
+      <w:pPr>
+        <w:pStyle w:val="ListBullet"/>
+      </w:pPr>
+      <w:r>
+        <w:rPr>
+          <w:sz w:val="21"/>
+        </w:rPr>
+      </w:r>
+      <w:r>
+        <w:rPr>
+          <w:b/>
+          <w:sz w:val="21"/>
+        </w:rPr>
+        <w:t>PR #33 — Accessibility audit and fixes</w:t>
+      </w:r>
+      <w:r>
+        <w:rPr>
+          <w:sz w:val="21"/>
+        </w:rPr>
+        <w:t xml:space="preserve"> — Frontend accessibility improvements.</w:t>
+      </w:r>
+    </w:p>
+    <w:p>
+      <w:pPr>
+        <w:pStyle w:val="ListBullet"/>
+      </w:pPr>
+      <w:r>
+        <w:rPr>
+          <w:sz w:val="21"/>
+        </w:rPr>
+      </w:r>
+      <w:r>
+        <w:rPr>
+          <w:b/>
+          <w:sz w:val="21"/>
+        </w:rPr>
+        <w:t>PR #34 — Docker Compose setup</w:t>
+      </w:r>
+      <w:r>
+        <w:rPr>
+          <w:sz w:val="21"/>
+        </w:rPr>
+        <w:t xml:space="preserve"> — Full docker-compose.yml with Postgres, API, and Web services for local development.</w:t>
+      </w:r>
+    </w:p>
+    <w:p>
+      <w:pPr>
+        <w:pStyle w:val="ListBullet"/>
+      </w:pPr>
+      <w:r>
+        <w:rPr>
+          <w:sz w:val="21"/>
+        </w:rPr>
+      </w:r>
+      <w:r>
+        <w:rPr>
+          <w:b/>
+          <w:sz w:val="21"/>
+        </w:rPr>
+        <w:t>Dashboard decomposed</w:t>
+      </w:r>
+      <w:r>
+        <w:rPr>
+          <w:sz w:val="21"/>
+        </w:rPr>
+        <w:t xml:space="preserve"> — Dashboard.tsx reduced from 951→365 lines; logic extracted into AddGoal.tsx, GoalCard.tsx, TodayBar.tsx, ErrorBoundary.tsx, GamificationSvgs.tsx components.</w:t>
+      </w:r>
+    </w:p>
+    <w:p>
+      <w:pPr>
+        <w:pStyle w:val="ListBullet"/>
+      </w:pPr>
+      <w:r>
+        <w:rPr>
+          <w:sz w:val="21"/>
+        </w:rPr>
+      </w:r>
+      <w:r>
+        <w:rPr>
+          <w:b/>
+          <w:sz w:val="21"/>
+        </w:rPr>
+        <w:t>Goals pagination implemented</w:t>
+      </w:r>
+      <w:r>
+        <w:rPr>
+          <w:sz w:val="21"/>
+        </w:rPr>
+        <w:t xml:space="preserve"> — list_goals now returns PaginatedGoalsResponse with limit/offset query parameters.</w:t>
       </w:r>
     </w:p>
     <w:p>
@@ -146,7 +379,7 @@
         <w:rPr>
           <w:sz w:val="21"/>
         </w:rPr>
-        <w:t xml:space="preserve"> — _decode_token in auth.py now catches jwt.ExpiredSignatureError and jwt.InvalidTokenError specifically, in addition to the existing broad fallback. This is a positive improvement, though a final broad catch-all remains.</w:t>
+        <w:t xml:space="preserve"> — _decode_token now catches jwt.ExpiredSignatureError and jwt.InvalidTokenError specifically.</w:t>
       </w:r>
     </w:p>
     <w:p>
@@ -163,82 +396,13 @@
           <w:b/>
           <w:sz w:val="21"/>
         </w:rPr>
-        <w:t>Dependency updates</w:t>
+        <w:t>Frontend dependencies updated</w:t>
       </w:r>
       <w:r>
         <w:rPr>
           <w:sz w:val="21"/>
         </w:rPr>
-        <w:t xml:space="preserve"> — Frontend dependencies have been updated: React 19, Vite 7, TypeScript 5.9, Tailwind CSS v4, axios 1.13.6 (apps/web/package.json).</w:t>
-      </w:r>
-    </w:p>
-    <w:p>
-      <w:pPr>
-        <w:pStyle w:val="ListBullet"/>
-      </w:pPr>
-      <w:r>
-        <w:rPr>
-          <w:sz w:val="21"/>
-        </w:rPr>
-      </w:r>
-      <w:r>
-        <w:rPr>
-          <w:b/>
-          <w:sz w:val="21"/>
-        </w:rPr>
-        <w:t>No new frontend tests added</w:t>
-      </w:r>
-      <w:r>
-        <w:rPr>
-          <w:sz w:val="21"/>
-        </w:rPr>
-        <w:t xml:space="preserve"> — The testing gap identified in the prior review remains.</w:t>
-      </w:r>
-    </w:p>
-    <w:p>
-      <w:pPr>
-        <w:pStyle w:val="ListBullet"/>
-      </w:pPr>
-      <w:r>
-        <w:rPr>
-          <w:sz w:val="21"/>
-        </w:rPr>
-      </w:r>
-      <w:r>
-        <w:rPr>
-          <w:b/>
-          <w:sz w:val="21"/>
-        </w:rPr>
-        <w:t>Dashboard.tsx remains monolithic</w:t>
-      </w:r>
-      <w:r>
-        <w:rPr>
-          <w:sz w:val="21"/>
-        </w:rPr>
-        <w:t xml:space="preserve"> — 951 lines with no decomposition.</w:t>
-      </w:r>
-    </w:p>
-    <w:p>
-      <w:pPr>
-        <w:pStyle w:val="ListBullet"/>
-      </w:pPr>
-      <w:r>
-        <w:rPr>
-          <w:sz w:val="21"/>
-        </w:rPr>
-      </w:r>
-      <w:r>
-        <w:rPr>
-          <w:b/>
-          <w:sz w:val="21"/>
-        </w:rPr>
-        <w:t>No pagination added</w:t>
-      </w:r>
-      <w:r>
-        <w:rPr>
-          <w:sz w:val="21"/>
-        </w:rPr>
-        <w:t xml:space="preserve"> — Goals listing API still returns all records without limits.</w:t>
+        <w:t xml:space="preserve"> — React 19, Vite 7, TypeScript 5.9, Tailwind CSS v4, axios 1.13.6.</w:t>
       </w:r>
     </w:p>
     <w:p>
@@ -246,7 +410,7 @@
         <w:rPr>
           <w:sz w:val="21"/>
         </w:rPr>
-        <w:t xml:space="preserve">New findings discovered in this review are identified with </w:t>
+        <w:t xml:space="preserve">New findings are identified with </w:t>
       </w:r>
       <w:r>
         <w:rPr>
@@ -259,7 +423,20 @@
         <w:rPr>
           <w:sz w:val="21"/>
         </w:rPr>
-        <w:t xml:space="preserve"> below.</w:t>
+        <w:t xml:space="preserve">; resolved items are marked </w:t>
+      </w:r>
+      <w:r>
+        <w:rPr>
+          <w:b/>
+          <w:sz w:val="21"/>
+        </w:rPr>
+        <w:t>[RESOLVED]</w:t>
+      </w:r>
+      <w:r>
+        <w:rPr>
+          <w:sz w:val="21"/>
+        </w:rPr>
+        <w:t>.</w:t>
       </w:r>
     </w:p>
     <w:p>
@@ -306,7 +483,7 @@
         <w:rPr>
           <w:sz w:val="21"/>
         </w:rPr>
-        <w:t xml:space="preserve"> — GoalForge has a differentiated loop: AI-generated SMART goals + sprint tasks + gamification (README.md, dashboard/analytics UX).</w:t>
+        <w:t xml:space="preserve"> — AI-generated SMART goals + sprint tasks + gamification.</w:t>
       </w:r>
     </w:p>
     <w:p>
@@ -329,7 +506,7 @@
         <w:rPr>
           <w:sz w:val="21"/>
         </w:rPr>
-        <w:t xml:space="preserve"> — Star points, streaks, evolution stages, and 'Hall of Fame' are implemented end-to-end and visible in UX (Dashboard.tsx, Analytics.tsx).</w:t>
+        <w:t xml:space="preserve"> — Star points, streaks, evolution stages, and 'Hall of Fame' implemented end-to-end.</w:t>
       </w:r>
     </w:p>
     <w:p>
@@ -346,13 +523,13 @@
           <w:b/>
           <w:sz w:val="21"/>
         </w:rPr>
-        <w:t>Foundational user journey exists</w:t>
+        <w:t>Foundational user journey is complete</w:t>
       </w:r>
       <w:r>
         <w:rPr>
           <w:sz w:val="21"/>
         </w:rPr>
-        <w:t xml:space="preserve"> — Sign-in/sign-up, dashboard, analytics, and protected routes are in place (App.tsx).</w:t>
+        <w:t xml:space="preserve"> — Sign-in/sign-up, dashboard, analytics, settings, and protected routes.</w:t>
       </w:r>
     </w:p>
     <w:p>
@@ -369,13 +546,105 @@
           <w:b/>
           <w:sz w:val="21"/>
         </w:rPr>
-        <w:t>[NEW] Active dependency maintenance</w:t>
+        <w:t>[RESOLVED] Dashboard is now modular</w:t>
       </w:r>
       <w:r>
         <w:rPr>
           <w:sz w:val="21"/>
         </w:rPr>
-        <w:t xml:space="preserve"> — Frontend dependencies are kept current (React 19, Vite 7, TypeScript 5.9), signaling an actively maintained project with low technical debt accumulation in the dependency layer.</w:t>
+        <w:t xml:space="preserve"> — Decomposed from 951→365 lines with dedicated components (AddGoal, GoalCard, TodayBar). Significantly reduces regression risk.</w:t>
+      </w:r>
+    </w:p>
+    <w:p>
+      <w:pPr>
+        <w:pStyle w:val="ListBullet"/>
+      </w:pPr>
+      <w:r>
+        <w:rPr>
+          <w:sz w:val="21"/>
+        </w:rPr>
+      </w:r>
+      <w:r>
+        <w:rPr>
+          <w:b/>
+          <w:sz w:val="21"/>
+        </w:rPr>
+        <w:t>[RESOLVED] Goals pagination implemented</w:t>
+      </w:r>
+      <w:r>
+        <w:rPr>
+          <w:sz w:val="21"/>
+        </w:rPr>
+        <w:t xml:space="preserve"> — list_goals now supports limit/offset pagination via PaginatedGoalsResponse.</w:t>
+      </w:r>
+    </w:p>
+    <w:p>
+      <w:pPr>
+        <w:pStyle w:val="ListBullet"/>
+      </w:pPr>
+      <w:r>
+        <w:rPr>
+          <w:sz w:val="21"/>
+        </w:rPr>
+      </w:r>
+      <w:r>
+        <w:rPr>
+          <w:b/>
+          <w:sz w:val="21"/>
+        </w:rPr>
+        <w:t>Active dependency maintenance</w:t>
+      </w:r>
+      <w:r>
+        <w:rPr>
+          <w:sz w:val="21"/>
+        </w:rPr>
+        <w:t xml:space="preserve"> — Frontend dependencies are current (React 19, Vite 7, TypeScript 5.9).</w:t>
+      </w:r>
+    </w:p>
+    <w:p>
+      <w:pPr>
+        <w:pStyle w:val="ListBullet"/>
+      </w:pPr>
+      <w:r>
+        <w:rPr>
+          <w:sz w:val="21"/>
+        </w:rPr>
+      </w:r>
+      <w:r>
+        <w:rPr>
+          <w:b/>
+          <w:sz w:val="21"/>
+        </w:rPr>
+        <w:t>[NEW] Docker Compose enables rapid onboarding</w:t>
+      </w:r>
+      <w:r>
+        <w:rPr>
+          <w:sz w:val="21"/>
+        </w:rPr>
+        <w:t xml:space="preserve"> — Single-command local dev environment (Postgres + API + Web).</w:t>
+      </w:r>
+    </w:p>
+    <w:p>
+      <w:pPr>
+        <w:pStyle w:val="ListBullet"/>
+      </w:pPr>
+      <w:r>
+        <w:rPr>
+          <w:sz w:val="21"/>
+        </w:rPr>
+      </w:r>
+      <w:r>
+        <w:rPr>
+          <w:b/>
+          <w:sz w:val="21"/>
+        </w:rPr>
+        <w:t>[NEW] Error boundary improves crash resilience</w:t>
+      </w:r>
+      <w:r>
+        <w:rPr>
+          <w:sz w:val="21"/>
+        </w:rPr>
+        <w:t xml:space="preserve"> — ErrorBoundary component wraps all routes, preventing full-app crashes.</w:t>
       </w:r>
     </w:p>
     <w:p>
@@ -404,29 +673,6 @@
           <w:b/>
           <w:sz w:val="21"/>
         </w:rPr>
-        <w:t>High feature concentration in one UI file slows iteration velocity</w:t>
-      </w:r>
-      <w:r>
-        <w:rPr>
-          <w:sz w:val="21"/>
-        </w:rPr>
-        <w:t xml:space="preserve"> — Dashboard behavior and rendering are concentrated in one large page component (Dashboard.tsx, 951 lines), increasing regression risk for roadmap delivery.</w:t>
-      </w:r>
-    </w:p>
-    <w:p>
-      <w:pPr>
-        <w:pStyle w:val="ListBullet"/>
-      </w:pPr>
-      <w:r>
-        <w:rPr>
-          <w:sz w:val="21"/>
-        </w:rPr>
-      </w:r>
-      <w:r>
-        <w:rPr>
-          <w:b/>
-          <w:sz w:val="21"/>
-        </w:rPr>
         <w:t>No frontend automated tests</w:t>
       </w:r>
       <w:r>
@@ -438,25 +684,22 @@
     </w:p>
     <w:p>
       <w:pPr>
-        <w:pStyle w:val="ListBullet"/>
+        <w:spacing w:before="120" w:after="120"/>
+        <w:ind w:left="432"/>
       </w:pPr>
       <w:r>
         <w:rPr>
+          <w:b/>
+          <w:color w:val="CC0000"/>
           <w:sz w:val="21"/>
         </w:rPr>
-      </w:r>
-      <w:r>
-        <w:rPr>
-          <w:b/>
-          <w:sz w:val="21"/>
-        </w:rPr>
-        <w:t>Scalability gap in goal listing API</w:t>
+        <w:t xml:space="preserve">⚠ [NEW] P0 BUG — Silent sprint generation failure on milestone advance: </w:t>
       </w:r>
       <w:r>
         <w:rPr>
           <w:sz w:val="21"/>
         </w:rPr>
-        <w:t xml:space="preserve"> — Goals API currently returns all goals without pagination (apps/api/main.py, list_goals), which can degrade UX and performance for heavy users.</w:t>
+        <w:t>In complete_milestone (apps/api/main.py, line 777), synchronous sprint task generation catches ValueError but generate_sprint_tasks raises AIGenerationError. AI generation errors bubble up as unhandled 500 responses rather than actionable 502 error messages.</w:t>
       </w:r>
     </w:p>
     <w:p>
@@ -479,27 +722,7 @@
         <w:rPr>
           <w:sz w:val="21"/>
         </w:rPr>
-        <w:t xml:space="preserve"> — Local backend tests can fail unless rate limiting is disabled via env override, while CI explicitly sets RATE_LIMIT_ENABLED=false (.github/workflows/ci.yml).</w:t>
-      </w:r>
-    </w:p>
-    <w:p>
-      <w:pPr>
-        <w:spacing w:before="120" w:after="120"/>
-        <w:ind w:left="432"/>
-      </w:pPr>
-      <w:r>
-        <w:rPr>
-          <w:b/>
-          <w:color w:val="CC0000"/>
-          <w:sz w:val="21"/>
-        </w:rPr>
-        <w:t xml:space="preserve">⚠ [NEW] P0 BUG — Silent sprint generation failure on milestone advance: </w:t>
-      </w:r>
-      <w:r>
-        <w:rPr>
-          <w:sz w:val="21"/>
-        </w:rPr>
-        <w:t>In complete_milestone (apps/api/main.py, line 657), synchronous sprint task generation catches ValueError but generate_sprint_tasks raises AIGenerationError. This mismatch means AI generation errors during milestone advancement bubble up as unhandled 500 responses rather than actionable 502 error messages.</w:t>
+        <w:t xml:space="preserve"> — Local tests need RATE_LIMIT_ENABLED=false.</w:t>
       </w:r>
     </w:p>
     <w:p>
@@ -534,7 +757,7 @@
         <w:rPr>
           <w:sz w:val="21"/>
         </w:rPr>
-        <w:t>Fix the wrong exception class in complete_milestone (catches ValueError instead of AIGenerationError) to restore correct error messaging when sprint generation fails.</w:t>
+        <w:t>Fix the wrong exception class in complete_milestone (ValueError → AIGenerationError).</w:t>
       </w:r>
     </w:p>
     <w:p>
@@ -545,18 +768,7 @@
         <w:rPr>
           <w:sz w:val="21"/>
         </w:rPr>
-        <w:t>Add frontend test baseline for critical flows (goal creation, task completion, status update).</w:t>
-      </w:r>
-    </w:p>
-    <w:p>
-      <w:pPr>
-        <w:pStyle w:val="ListBullet"/>
-      </w:pPr>
-      <w:r>
-        <w:rPr>
-          <w:sz w:val="21"/>
-        </w:rPr>
-        <w:t>Split Dashboard into composable feature components to reduce delivery risk.</w:t>
+        <w:t>Add frontend test baseline for critical flows (goal creation, task completion, milestone advance).</w:t>
       </w:r>
     </w:p>
     <w:p>
@@ -579,17 +791,6 @@
         <w:rPr>
           <w:sz w:val="21"/>
         </w:rPr>
-        <w:t>Add paginated goals listing and front-end support.</w:t>
-      </w:r>
-    </w:p>
-    <w:p>
-      <w:pPr>
-        <w:pStyle w:val="ListBullet"/>
-      </w:pPr>
-      <w:r>
-        <w:rPr>
-          <w:sz w:val="21"/>
-        </w:rPr>
         <w:t>Add explicit failure UX for profile/AI-related fetch degradation.</w:t>
       </w:r>
     </w:p>
@@ -602,6 +803,17 @@
           <w:sz w:val="21"/>
         </w:rPr>
         <w:t>Migrate FastAPI startup handler from deprecated on_event to lifespan pattern.</w:t>
+      </w:r>
+    </w:p>
+    <w:p>
+      <w:pPr>
+        <w:pStyle w:val="ListBullet"/>
+      </w:pPr>
+      <w:r>
+        <w:rPr>
+          <w:sz w:val="21"/>
+        </w:rPr>
+        <w:t>Add frontend pagination controls to match backend pagination support.</w:t>
       </w:r>
     </w:p>
     <w:p>
@@ -671,7 +883,7 @@
         <w:rPr>
           <w:sz w:val="21"/>
         </w:rPr>
-        <w:t xml:space="preserve"> — Good separation of concerns across main.py, auth.py, ai_utils.py, schemas.py, and models.py.</w:t>
+        <w:t xml:space="preserve"> — Good separation across main.py, auth.py, ai_utils.py, schemas.py, models.py.</w:t>
       </w:r>
     </w:p>
     <w:p>
@@ -688,13 +900,13 @@
           <w:b/>
           <w:sz w:val="21"/>
         </w:rPr>
-        <w:t>[NEW] Improved auth exception specificity</w:t>
+        <w:t>Improved auth exception specificity</w:t>
       </w:r>
       <w:r>
         <w:rPr>
           <w:sz w:val="21"/>
         </w:rPr>
-        <w:t xml:space="preserve"> — _decode_token in auth.py now explicitly catches jwt.ExpiredSignatureError and jwt.InvalidTokenError, enabling differentiated error responses and improved observability.</w:t>
+        <w:t xml:space="preserve"> — _decode_token now catches jwt.ExpiredSignatureError and jwt.InvalidTokenError.</w:t>
       </w:r>
     </w:p>
     <w:p>
@@ -717,7 +929,7 @@
         <w:rPr>
           <w:sz w:val="21"/>
         </w:rPr>
-        <w:t xml:space="preserve"> — JWT verification with JWKS fetch/caching (auth.py); auth checks enforced per route ownership; CORS configured from env.</w:t>
+        <w:t xml:space="preserve"> — JWT verification with JWKS fetch/caching; auth checks enforced per route; CORS configured from env.</w:t>
       </w:r>
     </w:p>
     <w:p>
@@ -734,13 +946,13 @@
           <w:b/>
           <w:sz w:val="21"/>
         </w:rPr>
-        <w:t>AI output schema constraints are present</w:t>
+        <w:t>AI output schema constraints</w:t>
       </w:r>
       <w:r>
         <w:rPr>
           <w:sz w:val="21"/>
         </w:rPr>
-        <w:t xml:space="preserve"> — Gemini responses are validated through Pydantic schemas (ai_utils.py, schemas.py), reducing malformed-output risk.</w:t>
+        <w:t xml:space="preserve"> — Gemini responses validated through Pydantic schemas.</w:t>
       </w:r>
     </w:p>
     <w:p>
@@ -763,7 +975,7 @@
         <w:rPr>
           <w:sz w:val="21"/>
         </w:rPr>
-        <w:t xml:space="preserve"> — API integration tests in apps/api/tests cover key goal/task/milestone flows — 23 tests, all passing.</w:t>
+        <w:t xml:space="preserve"> — All tests passing.</w:t>
       </w:r>
     </w:p>
     <w:p>
@@ -780,13 +992,128 @@
           <w:b/>
           <w:sz w:val="21"/>
         </w:rPr>
-        <w:t>[NEW] CI pipeline is comprehensive</w:t>
+        <w:t>CI pipeline is comprehensive</w:t>
       </w:r>
       <w:r>
         <w:rPr>
           <w:sz w:val="21"/>
         </w:rPr>
-        <w:t xml:space="preserve"> — The CI workflow runs backend tests plus frontend lint, TypeScript type check, and build on every push and PR.</w:t>
+        <w:t xml:space="preserve"> — Backend tests plus frontend lint, TypeScript type check, and build on every push/PR.</w:t>
+      </w:r>
+    </w:p>
+    <w:p>
+      <w:pPr>
+        <w:pStyle w:val="ListBullet"/>
+      </w:pPr>
+      <w:r>
+        <w:rPr>
+          <w:sz w:val="21"/>
+        </w:rPr>
+      </w:r>
+      <w:r>
+        <w:rPr>
+          <w:b/>
+          <w:sz w:val="21"/>
+        </w:rPr>
+        <w:t>[NEW] Structured logging with request ID tracing</w:t>
+      </w:r>
+      <w:r>
+        <w:rPr>
+          <w:sz w:val="21"/>
+        </w:rPr>
+        <w:t xml:space="preserve"> — request_id_var ContextVar propagates a unique ID per request, included in all log entries and X-Request-ID response header. JSON formatter in production, human-readable in dev. Significant observability improvement.</w:t>
+      </w:r>
+    </w:p>
+    <w:p>
+      <w:pPr>
+        <w:pStyle w:val="ListBullet"/>
+      </w:pPr>
+      <w:r>
+        <w:rPr>
+          <w:sz w:val="21"/>
+        </w:rPr>
+      </w:r>
+      <w:r>
+        <w:rPr>
+          <w:b/>
+          <w:sz w:val="21"/>
+        </w:rPr>
+        <w:t>[NEW] DB connection pooling and enhanced health check</w:t>
+      </w:r>
+      <w:r>
+        <w:rPr>
+          <w:sz w:val="21"/>
+        </w:rPr>
+        <w:t xml:space="preserve"> — Health endpoint verifies database connectivity.</w:t>
+      </w:r>
+    </w:p>
+    <w:p>
+      <w:pPr>
+        <w:pStyle w:val="ListBullet"/>
+      </w:pPr>
+      <w:r>
+        <w:rPr>
+          <w:sz w:val="21"/>
+        </w:rPr>
+      </w:r>
+      <w:r>
+        <w:rPr>
+          <w:b/>
+          <w:sz w:val="21"/>
+        </w:rPr>
+        <w:t>[RESOLVED] Dashboard decomposed into components</w:t>
+      </w:r>
+      <w:r>
+        <w:rPr>
+          <w:sz w:val="21"/>
+        </w:rPr>
+        <w:t xml:space="preserve"> — Frontend code organization significantly improved with extraction of AddGoal, GoalCard, TodayBar, ErrorBoundary, and GamificationSvgs components.</w:t>
+      </w:r>
+    </w:p>
+    <w:p>
+      <w:pPr>
+        <w:pStyle w:val="ListBullet"/>
+      </w:pPr>
+      <w:r>
+        <w:rPr>
+          <w:sz w:val="21"/>
+        </w:rPr>
+      </w:r>
+      <w:r>
+        <w:rPr>
+          <w:b/>
+          <w:sz w:val="21"/>
+        </w:rPr>
+        <w:t>[RESOLVED] Goals API now paginated</w:t>
+      </w:r>
+      <w:r>
+        <w:rPr>
+          <w:sz w:val="21"/>
+        </w:rPr>
+        <w:t xml:space="preserve"> — list_goals uses PaginatedGoalsResponse with limit/offset parameters.</w:t>
+      </w:r>
+    </w:p>
+    <w:p>
+      <w:pPr>
+        <w:pStyle w:val="ListBullet"/>
+      </w:pPr>
+      <w:r>
+        <w:rPr>
+          <w:sz w:val="21"/>
+        </w:rPr>
+      </w:r>
+      <w:r>
+        <w:rPr>
+          <w:b/>
+          <w:sz w:val="21"/>
+        </w:rPr>
+        <w:t>[NEW] Docker Compose for local development</w:t>
+      </w:r>
+      <w:r>
+        <w:rPr>
+          <w:sz w:val="21"/>
+        </w:rPr>
+        <w:t xml:space="preserve"> — Complete containerized setup with Postgres, API, and Web services.</w:t>
       </w:r>
     </w:p>
     <w:p>
@@ -812,13 +1139,13 @@
           <w:color w:val="CC0000"/>
           <w:sz w:val="21"/>
         </w:rPr>
-        <w:t xml:space="preserve">⚠ [NEW] BUG: Wrong exception caught in complete_milestone: </w:t>
+        <w:t xml:space="preserve">⚠ P0 BUG: Wrong exception caught in complete_milestone: </w:t>
       </w:r>
       <w:r>
         <w:rPr>
           <w:sz w:val="21"/>
         </w:rPr>
-        <w:t>At apps/api/main.py line 657, 'except ValueError as exc:' should be 'except AIGenerationError as exc:'. The generate_sprint_tasks function raises AIGenerationError (defined in exceptions.py), never ValueError. Sync generation failures propagate as unhandled 500 Internal Server Errors instead of the intended 502.</w:t>
+        <w:t>At apps/api/main.py line 777, 'except ValueError' should be 'except AIGenerationError'. generate_sprint_tasks raises AIGenerationError (exceptions.py), never ValueError. Sync generation failures propagate as unhandled 500s.</w:t>
       </w:r>
     </w:p>
     <w:p>
@@ -931,7 +1258,7 @@
         <w:rPr>
           <w:sz w:val="21"/>
         </w:rPr>
-        <w:t xml:space="preserve"> — While specific handlers for jwt.ExpiredSignatureError and jwt.InvalidTokenError have been added, a final broad 'except Exception' fallback remains in _decode_token (auth.py, lines 105-109). This still masks unexpected failures and reduces observability.</w:t>
+        <w:t xml:space="preserve"> — A final broad 'except Exception' fallback remains in _decode_token.</w:t>
       </w:r>
     </w:p>
     <w:p>
@@ -945,13 +1272,13 @@
           <w:color w:val="CC8800"/>
           <w:sz w:val="21"/>
         </w:rPr>
-        <w:t xml:space="preserve">⚠ [NEW] Deprecated FastAPI startup event handler: </w:t>
+        <w:t xml:space="preserve">⚠ Deprecated FastAPI startup event handler: </w:t>
       </w:r>
       <w:r>
         <w:rPr>
           <w:sz w:val="21"/>
         </w:rPr>
-        <w:t>@app.on_event('startup') in apps/api/main.py (line 94) is deprecated in FastAPI and emits a DeprecationWarning visible in test output. The recommended replacement is the lifespan context manager pattern.</w:t>
+        <w:t>@app.on_event('startup') in main.py (line 160) is deprecated in FastAPI and emits DeprecationWarning. Replace with lifespan context manager pattern.</w:t>
       </w:r>
     </w:p>
     <w:p>
@@ -968,13 +1295,12 @@
           <w:b/>
           <w:sz w:val="21"/>
         </w:rPr>
-        <w:t>Rate-limit keying strategy can cause noisy-neighbor effects</w:t>
+        <w:t>Rate-limit keying strategy can cause noisy-neighbor effects.</w:t>
       </w:r>
       <w:r>
         <w:rPr>
           <w:sz w:val="21"/>
         </w:rPr>
-        <w:t xml:space="preserve"> — _user_key uses path_params.user_id fallback to remote address (main.py). This can be gamed by path variance and can cluster users behind shared IPs.</w:t>
       </w:r>
     </w:p>
     <w:p>
@@ -991,13 +1317,13 @@
           <w:b/>
           <w:sz w:val="21"/>
         </w:rPr>
-        <w:t>Frontend reliability and maintainability pressure</w:t>
+        <w:t>Frontend test gap</w:t>
       </w:r>
       <w:r>
         <w:rPr>
           <w:sz w:val="21"/>
         </w:rPr>
-        <w:t xml:space="preserve"> — Monolithic component (Dashboard.tsx, 951 lines) with mixed concerns. Repeated data-fetch patterns across Dashboard.tsx and Analytics.tsx could be centralized into shared hooks.</w:t>
+        <w:t xml:space="preserve"> — Backend has tests; frontend has none.</w:t>
       </w:r>
     </w:p>
     <w:p>
@@ -1014,36 +1340,13 @@
           <w:b/>
           <w:sz w:val="21"/>
         </w:rPr>
-        <w:t>API scalability and resilience</w:t>
+        <w:t>API resilience</w:t>
       </w:r>
       <w:r>
         <w:rPr>
           <w:sz w:val="21"/>
         </w:rPr>
-        <w:t xml:space="preserve"> — No pagination in goals listing. Background task generation uses asyncio.create_task and logs errors, but no durable retry queue/mechanism.</w:t>
-      </w:r>
-    </w:p>
-    <w:p>
-      <w:pPr>
-        <w:pStyle w:val="ListBullet"/>
-      </w:pPr>
-      <w:r>
-        <w:rPr>
-          <w:sz w:val="21"/>
-        </w:rPr>
-      </w:r>
-      <w:r>
-        <w:rPr>
-          <w:b/>
-          <w:sz w:val="21"/>
-        </w:rPr>
-        <w:t>Test and quality asymmetry</w:t>
-      </w:r>
-      <w:r>
-        <w:rPr>
-          <w:sz w:val="21"/>
-        </w:rPr>
-        <w:t xml:space="preserve"> — Backend has tests; frontend has none. CI runs lint/type-check/build for web, but frontend behavior regressions remain largely unguarded.</w:t>
+        <w:t xml:space="preserve"> — Background task generation uses asyncio.create_task and logs errors, but no durable retry queue/mechanism.</w:t>
       </w:r>
     </w:p>
     <w:p>
@@ -1078,7 +1381,7 @@
         <w:rPr>
           <w:sz w:val="21"/>
         </w:rPr>
-        <w:t>Fix complete_milestone: change 'except ValueError' to 'except AIGenerationError' to restore correct error handling.</w:t>
+        <w:t>Fix complete_milestone: change 'except ValueError' to 'except AIGenerationError'.</w:t>
       </w:r>
     </w:p>
     <w:p>
@@ -1100,7 +1403,7 @@
         <w:rPr>
           <w:sz w:val="21"/>
         </w:rPr>
-        <w:t>Add frontend tests for highest-risk interactions (goal creation, task completion, milestone advance).</w:t>
+        <w:t>Add frontend tests for highest-risk interactions.</w:t>
       </w:r>
     </w:p>
     <w:p>
@@ -1134,7 +1437,7 @@
         <w:rPr>
           <w:sz w:val="21"/>
         </w:rPr>
-        <w:t>Refactor Dashboard.tsx into domain-focused components/hooks.</w:t>
+        <w:t>Add frontend pagination controls to match backend pagination support.</w:t>
       </w:r>
     </w:p>
     <w:p>
@@ -1145,7 +1448,7 @@
         <w:rPr>
           <w:sz w:val="21"/>
         </w:rPr>
-        <w:t>Introduce shared data-fetch hooks (goals/profile) to remove duplication between Dashboard and Analytics.</w:t>
+        <w:t>Consider adding e2e tests using the Docker Compose environment.</w:t>
       </w:r>
     </w:p>
     <w:p>
@@ -1168,7 +1471,7 @@
         <w:rPr>
           <w:sz w:val="21"/>
         </w:rPr>
-        <w:t>Add cursor/offset pagination for /users/{user_id}/goals.</w:t>
+        <w:t>Add observability metrics for AI generation latency/failure rate (leveraging new structured logging).</w:t>
       </w:r>
     </w:p>
     <w:p>
@@ -1179,7 +1482,7 @@
         <w:rPr>
           <w:sz w:val="21"/>
         </w:rPr>
-        <w:t>Add observability metrics for AI generation latency/failure rate.</w:t>
+        <w:t>Add cursor-based pagination option for better performance at scale.</w:t>
       </w:r>
     </w:p>
     <w:p>
@@ -1199,7 +1502,20 @@
         <w:rPr>
           <w:sz w:val="21"/>
         </w:rPr>
-        <w:t>Commands executed in this review (2026-03-14):</w:t>
+        <w:t xml:space="preserve">Commands executed in this review (2026-03-14) against the </w:t>
+      </w:r>
+      <w:r>
+        <w:rPr>
+          <w:b/>
+          <w:sz w:val="21"/>
+        </w:rPr>
+        <w:t>main</w:t>
+      </w:r>
+      <w:r>
+        <w:rPr>
+          <w:sz w:val="21"/>
+        </w:rPr>
+        <w:t xml:space="preserve"> branch:</w:t>
       </w:r>
     </w:p>
     <w:p>
@@ -1255,7 +1571,7 @@
         <w:rPr>
           <w:sz w:val="21"/>
         </w:rPr>
-        <w:t>npm run build — PASS (323 KB JS bundle, gzip 97 KB)</w:t>
+        <w:t>npm run build — PASS</w:t>
       </w:r>
     </w:p>
     <w:p>
@@ -1278,7 +1594,7 @@
         <w:rPr>
           <w:sz w:val="21"/>
         </w:rPr>
-        <w:t>python -m pytest tests/ -v (with RATE_LIMIT_ENABLED=false GEMINI_API_KEY=dummy DATABASE_URL=sqlite+aiosqlite:///:memory:)</w:t>
+        <w:t>python -m pytest tests/ -v (with RATE_LIMIT_ENABLED=false GEMINI_API_KEY=dummy)</w:t>
       </w:r>
     </w:p>
     <w:p>
@@ -1312,7 +1628,7 @@
         <w:rPr>
           <w:sz w:val="21"/>
         </w:rPr>
-        <w:t>Backend tests: 23/23 passed (2 deprecation warnings — on_event startup handler)</w:t>
+        <w:t>Backend tests: all passed (deprecation warnings — on_event startup handler)</w:t>
       </w:r>
     </w:p>
     <w:p>
@@ -1332,7 +1648,7 @@
         <w:rPr>
           <w:sz w:val="21"/>
         </w:rPr>
-        <w:t xml:space="preserve">GoalForge is in a </w:t>
+        <w:t xml:space="preserve">GoalForge is in </w:t>
       </w:r>
       <w:r>
         <w:rPr>
@@ -1345,7 +1661,168 @@
         <w:rPr>
           <w:sz w:val="21"/>
         </w:rPr>
-        <w:t>: coherent product loop, good backend structure, and a comprehensive CI pipeline.</w:t>
+        <w:t xml:space="preserve"> and has made substantial progress since the previous review. The main branch now includes:</w:t>
+      </w:r>
+    </w:p>
+    <w:p>
+      <w:pPr>
+        <w:pStyle w:val="ListBullet"/>
+      </w:pPr>
+      <w:r>
+        <w:rPr>
+          <w:sz w:val="21"/>
+        </w:rPr>
+      </w:r>
+      <w:r>
+        <w:rPr>
+          <w:b/>
+          <w:sz w:val="21"/>
+        </w:rPr>
+        <w:t>Dashboard decomposition</w:t>
+      </w:r>
+      <w:r>
+        <w:rPr>
+          <w:sz w:val="21"/>
+        </w:rPr>
+        <w:t xml:space="preserve"> (951→365 lines, 5+ extracted components)</w:t>
+      </w:r>
+    </w:p>
+    <w:p>
+      <w:pPr>
+        <w:pStyle w:val="ListBullet"/>
+      </w:pPr>
+      <w:r>
+        <w:rPr>
+          <w:sz w:val="21"/>
+        </w:rPr>
+      </w:r>
+      <w:r>
+        <w:rPr>
+          <w:b/>
+          <w:sz w:val="21"/>
+        </w:rPr>
+        <w:t>Goals pagination</w:t>
+      </w:r>
+      <w:r>
+        <w:rPr>
+          <w:sz w:val="21"/>
+        </w:rPr>
+        <w:t xml:space="preserve"> (backend + schema support)</w:t>
+      </w:r>
+    </w:p>
+    <w:p>
+      <w:pPr>
+        <w:pStyle w:val="ListBullet"/>
+      </w:pPr>
+      <w:r>
+        <w:rPr>
+          <w:sz w:val="21"/>
+        </w:rPr>
+      </w:r>
+      <w:r>
+        <w:rPr>
+          <w:b/>
+          <w:sz w:val="21"/>
+        </w:rPr>
+        <w:t>Structured logging</w:t>
+      </w:r>
+      <w:r>
+        <w:rPr>
+          <w:sz w:val="21"/>
+        </w:rPr>
+        <w:t xml:space="preserve"> with request ID tracing</w:t>
+      </w:r>
+    </w:p>
+    <w:p>
+      <w:pPr>
+        <w:pStyle w:val="ListBullet"/>
+      </w:pPr>
+      <w:r>
+        <w:rPr>
+          <w:sz w:val="21"/>
+        </w:rPr>
+      </w:r>
+      <w:r>
+        <w:rPr>
+          <w:b/>
+          <w:sz w:val="21"/>
+        </w:rPr>
+        <w:t>User settings</w:t>
+      </w:r>
+      <w:r>
+        <w:rPr>
+          <w:sz w:val="21"/>
+        </w:rPr>
+        <w:t xml:space="preserve"> (timezone, display name)</w:t>
+      </w:r>
+    </w:p>
+    <w:p>
+      <w:pPr>
+        <w:pStyle w:val="ListBullet"/>
+      </w:pPr>
+      <w:r>
+        <w:rPr>
+          <w:sz w:val="21"/>
+        </w:rPr>
+      </w:r>
+      <w:r>
+        <w:rPr>
+          <w:b/>
+          <w:sz w:val="21"/>
+        </w:rPr>
+        <w:t>Error boundary</w:t>
+      </w:r>
+      <w:r>
+        <w:rPr>
+          <w:sz w:val="21"/>
+        </w:rPr>
+        <w:t xml:space="preserve"> for crash resilience</w:t>
+      </w:r>
+    </w:p>
+    <w:p>
+      <w:pPr>
+        <w:pStyle w:val="ListBullet"/>
+      </w:pPr>
+      <w:r>
+        <w:rPr>
+          <w:sz w:val="21"/>
+        </w:rPr>
+      </w:r>
+      <w:r>
+        <w:rPr>
+          <w:b/>
+          <w:sz w:val="21"/>
+        </w:rPr>
+        <w:t>Docker Compose</w:t>
+      </w:r>
+      <w:r>
+        <w:rPr>
+          <w:sz w:val="21"/>
+        </w:rPr>
+        <w:t xml:space="preserve"> for single-command local development</w:t>
+      </w:r>
+    </w:p>
+    <w:p>
+      <w:pPr>
+        <w:pStyle w:val="ListBullet"/>
+      </w:pPr>
+      <w:r>
+        <w:rPr>
+          <w:sz w:val="21"/>
+        </w:rPr>
+      </w:r>
+      <w:r>
+        <w:rPr>
+          <w:b/>
+          <w:sz w:val="21"/>
+        </w:rPr>
+        <w:t>DB connection pooling</w:t>
+      </w:r>
+      <w:r>
+        <w:rPr>
+          <w:sz w:val="21"/>
+        </w:rPr>
+        <w:t xml:space="preserve"> and enhanced health checks</w:t>
       </w:r>
     </w:p>
     <w:p>
@@ -1353,7 +1830,7 @@
         <w:rPr>
           <w:sz w:val="21"/>
         </w:rPr>
-        <w:t xml:space="preserve">Since the previous review (2026-03-13), the most notable improvement is partial auth exception specificity in _decode_token. However, one new </w:t>
+        <w:t xml:space="preserve">One </w:t>
       </w:r>
       <w:r>
         <w:rPr>
@@ -1366,7 +1843,7 @@
         <w:rPr>
           <w:sz w:val="21"/>
         </w:rPr>
-        <w:t xml:space="preserve"> was discovered: complete_milestone catches the wrong exception class (ValueError instead of AIGenerationError), meaning synchronous sprint generation failures during milestone advancement surface as unhandled 500 errors rather than the intended actionable 502 responses.</w:t>
+        <w:t xml:space="preserve"> remains: complete_milestone catches ValueError instead of AIGenerationError at line 777, causing synchronous sprint generation failures to surface as unhandled 500 errors.</w:t>
       </w:r>
     </w:p>
     <w:p>
@@ -1374,7 +1851,7 @@
         <w:rPr>
           <w:sz w:val="21"/>
         </w:rPr>
-        <w:t>The highest-leverage next work remains:</w:t>
+        <w:t>The highest-leverage remaining work:</w:t>
       </w:r>
     </w:p>
     <w:p>
@@ -1420,7 +1897,7 @@
         <w:rPr>
           <w:sz w:val="21"/>
         </w:rPr>
-        <w:t xml:space="preserve"> (tests + dashboard decomposition)</w:t>
+        <w:t xml:space="preserve"> — add automated tests for critical user flows</w:t>
       </w:r>
     </w:p>
     <w:p>
@@ -1443,7 +1920,7 @@
         <w:rPr>
           <w:sz w:val="21"/>
         </w:rPr>
-        <w:t xml:space="preserve"> (remove remaining broad auth fallback, migrate startup handler)</w:t>
+        <w:t xml:space="preserve"> — remove remaining broad auth fallback, migrate startup handler</w:t>
       </w:r>
     </w:p>
     <w:p>
@@ -1460,13 +1937,13 @@
           <w:b/>
           <w:sz w:val="21"/>
         </w:rPr>
-        <w:t>Scalability guardrails</w:t>
+        <w:t>UX completion</w:t>
       </w:r>
       <w:r>
         <w:rPr>
           <w:sz w:val="21"/>
         </w:rPr>
-        <w:t xml:space="preserve"> (pagination + improved async task reliability)</w:t>
+        <w:t xml:space="preserve"> — add frontend pagination controls, failure UX for AI degradation</w:t>
       </w:r>
     </w:p>
     <w:p>

</xml_diff>